<commit_message>
docs: remove repeated client questions after source review
Separate answered lead and channel rules from eight targeted clarifications. Preserve all prior question decisions and unresolved audio checks in the internal report.

ТЗ: docs/tz/TZ-DOCS-DELIVERY.md#U
Atom: eurosteklo-a58
</commit_message>
<xml_diff>
--- a/docs/review/2026-10-05-consistency/Евростекло-уточнение-процесса.docx
+++ b/docs/review/2026-10-05-consistency/Евростекло-уточнение-процесса.docx
@@ -12,7 +12,7 @@
     </w:p>
     <w:p>
       <w:r>
-        <w:t>Ответьте на каждый подпункт. Если в пункте изложено правило и оно целиком верно, напишите «Подтверждаю»; если нет — исправьте его. В открытых вопросах укажите конкретные действия, ответственных, условия или сроки: одного «да» недостаточно. Если информации нет, так и напишите. Пустой ответ не означает согласия. Ответы уточняют требования к процессу; они не являются разрешением на разработку ТЗ или настройку системы.</w:t>
+        <w:t>Впишите ответ рядом с каждым вопросом. Если приложенный документ уже содержит ответ, укажите его название и нужный раздел — повторять описание не требуется. Вопросы с выбором варианта требуют указать этот вариант; одного «да» недостаточно. Если правило не установлено или не применяется, так и напишите. Пустая ячейка не означает согласия.</w:t>
       </w:r>
     </w:p>
     <w:p>
@@ -20,21 +20,20 @@
         <w:pStyle w:val="Heading1"/>
       </w:pPr>
       <w:r>
-        <w:t>Лиды и каналы обращений</w:t>
+        <w:t>Сделки и обратная связь</w:t>
       </w:r>
     </w:p>
     <w:tbl>
       <w:tblPr>
         <w:tblStyle w:val="TableGrid"/>
         <w:tblW w:type="auto" w:w="0"/>
-        <w:jc w:val="center"/>
         <w:tblLayout w:type="fixed"/>
         <w:tblLook w:firstColumn="1" w:firstRow="1" w:lastColumn="0" w:lastRow="0" w:noHBand="0" w:noVBand="1" w:val="04A0"/>
       </w:tblPr>
       <w:tblGrid>
-        <w:gridCol w:w="454"/>
-        <w:gridCol w:w="5216"/>
-        <w:gridCol w:w="4422"/>
+        <w:gridCol w:w="3364"/>
+        <w:gridCol w:w="3364"/>
+        <w:gridCol w:w="3364"/>
       </w:tblGrid>
       <w:tr>
         <w:trPr>
@@ -43,14 +42,9 @@
         <w:tc>
           <w:tcPr>
             <w:tcW w:type="dxa" w:w="454"/>
-            <w:vAlign w:val="center"/>
-            <w:shd w:fill="F2F2F2"/>
           </w:tcPr>
           <w:p>
             <w:r>
-              <w:rPr>
-                <w:b/>
-              </w:rPr>
               <w:t>№</w:t>
             </w:r>
           </w:p>
@@ -58,14 +52,9 @@
         <w:tc>
           <w:tcPr>
             <w:tcW w:type="dxa" w:w="5216"/>
-            <w:vAlign w:val="center"/>
-            <w:shd w:fill="F2F2F2"/>
           </w:tcPr>
           <w:p>
             <w:r>
-              <w:rPr>
-                <w:b/>
-              </w:rPr>
               <w:t>Вопрос</w:t>
             </w:r>
           </w:p>
@@ -73,14 +62,9 @@
         <w:tc>
           <w:tcPr>
             <w:tcW w:type="dxa" w:w="4422"/>
-            <w:vAlign w:val="center"/>
-            <w:shd w:fill="F2F2F2"/>
           </w:tcPr>
           <w:p>
             <w:r>
-              <w:rPr>
-                <w:b/>
-              </w:rPr>
               <w:t>Ответ клиента</w:t>
             </w:r>
           </w:p>
@@ -88,13 +72,11 @@
       </w:tr>
       <w:tr>
         <w:trPr>
-          <w:trHeight w:val="935" w:hRule="atLeast"/>
           <w:cantSplit/>
         </w:trPr>
         <w:tc>
           <w:tcPr>
             <w:tcW w:type="dxa" w:w="454"/>
-            <w:vAlign w:val="top"/>
           </w:tcPr>
           <w:p>
             <w:r>
@@ -105,44 +87,35 @@
         <w:tc>
           <w:tcPr>
             <w:tcW w:type="dxa" w:w="5216"/>
-            <w:vAlign w:val="top"/>
           </w:tcPr>
           <w:p>
             <w:r>
-              <w:rPr>
-                <w:b/>
-              </w:rPr>
-              <w:t>Каналы</w:t>
-            </w:r>
-          </w:p>
-          <w:p>
-            <w:r>
-              <w:rPr>
-                <w:b w:val="0"/>
-              </w:rPr>
-              <w:t>Какие мессенджеры включаем в текущий процесс?</w:t>
+              <w:t>Ожидание ответа по расчёту</w:t>
+              <w:br/>
+              <w:t>Сколько дней без ответа клиента на стадии «Предварительный расчёт» должно пройти, прежде чем руководитель отдела продаж получит задачу разобраться со сделкой? Укажите, рабочие это дни или календарные.</w:t>
             </w:r>
           </w:p>
         </w:tc>
         <w:tc>
           <w:tcPr>
             <w:tcW w:type="dxa" w:w="4422"/>
-            <w:vAlign w:val="top"/>
           </w:tcPr>
           <w:p>
-            <w:r/>
+            <w:r>
+              <w:br/>
+              <w:br/>
+              <w:br/>
+            </w:r>
           </w:p>
         </w:tc>
       </w:tr>
       <w:tr>
         <w:trPr>
-          <w:trHeight w:val="935" w:hRule="atLeast"/>
           <w:cantSplit/>
         </w:trPr>
         <w:tc>
           <w:tcPr>
             <w:tcW w:type="dxa" w:w="454"/>
-            <w:vAlign w:val="top"/>
           </w:tcPr>
           <w:p>
             <w:r>
@@ -153,44 +126,35 @@
         <w:tc>
           <w:tcPr>
             <w:tcW w:type="dxa" w:w="5216"/>
-            <w:vAlign w:val="top"/>
           </w:tcPr>
           <w:p>
             <w:r>
-              <w:rPr>
-                <w:b/>
-              </w:rPr>
-              <w:t>Рекомендации</w:t>
-            </w:r>
-          </w:p>
-          <w:p>
-            <w:r>
-              <w:rPr>
-                <w:b w:val="0"/>
-              </w:rPr>
-              <w:t>Кто отвечает за обращения с почты рекомендаций? Кто передаёт их менеджеру?</w:t>
+              <w:t>Звонки после заказа без монтажа</w:t>
+              <w:br/>
+              <w:t>От какой даты отсчитываем сроки звонков клиенту, если заказ выполнен без монтажа?</w:t>
             </w:r>
           </w:p>
         </w:tc>
         <w:tc>
           <w:tcPr>
             <w:tcW w:type="dxa" w:w="4422"/>
-            <w:vAlign w:val="top"/>
           </w:tcPr>
           <w:p>
-            <w:r/>
+            <w:r>
+              <w:br/>
+              <w:br/>
+              <w:br/>
+            </w:r>
           </w:p>
         </w:tc>
       </w:tr>
       <w:tr>
         <w:trPr>
-          <w:trHeight w:val="935" w:hRule="atLeast"/>
           <w:cantSplit/>
         </w:trPr>
         <w:tc>
           <w:tcPr>
             <w:tcW w:type="dxa" w:w="454"/>
-            <w:vAlign w:val="top"/>
           </w:tcPr>
           <w:p>
             <w:r>
@@ -201,846 +165,29 @@
         <w:tc>
           <w:tcPr>
             <w:tcW w:type="dxa" w:w="5216"/>
-            <w:vAlign w:val="top"/>
           </w:tcPr>
           <w:p>
             <w:r>
-              <w:rPr>
-                <w:b/>
-              </w:rPr>
-              <w:t>Работа с лидом</w:t>
-            </w:r>
-          </w:p>
-          <w:p>
-            <w:r>
-              <w:rPr>
-                <w:b w:val="0"/>
-              </w:rPr>
-              <w:t>При каком событии менеджеру нужна отдельная задача по лиду? Когда достаточно самого обращения?</w:t>
+              <w:t>Сумма заказа для звонков</w:t>
+              <w:br/>
+              <w:t>Какую минимальную сумму заказа устанавливаем для звонков по обратной связи? Если ограничение по сумме не нужно, напишите «Звоним всем».</w:t>
             </w:r>
           </w:p>
         </w:tc>
         <w:tc>
           <w:tcPr>
             <w:tcW w:type="dxa" w:w="4422"/>
-            <w:vAlign w:val="top"/>
-          </w:tcPr>
-          <w:p>
-            <w:r/>
-          </w:p>
-        </w:tc>
-      </w:tr>
-      <w:tr>
-        <w:trPr>
-          <w:trHeight w:val="935" w:hRule="atLeast"/>
-          <w:cantSplit/>
-        </w:trPr>
-        <w:tc>
-          <w:tcPr>
-            <w:tcW w:type="dxa" w:w="454"/>
-            <w:vAlign w:val="top"/>
           </w:tcPr>
           <w:p>
             <w:r>
-              <w:t>4</w:t>
+              <w:br/>
+              <w:br/>
+              <w:br/>
             </w:r>
-          </w:p>
-        </w:tc>
-        <w:tc>
-          <w:tcPr>
-            <w:tcW w:type="dxa" w:w="5216"/>
-            <w:vAlign w:val="top"/>
-          </w:tcPr>
-          <w:p>
-            <w:r>
-              <w:rPr>
-                <w:b/>
-              </w:rPr>
-              <w:t>Срок реакции</w:t>
-            </w:r>
-          </w:p>
-          <w:p>
-            <w:r>
-              <w:rPr>
-                <w:b w:val="0"/>
-              </w:rPr>
-              <w:t>Для обратного звонка ориентир — примерно 15 минут в рабочее время. Ниже уточняем начало и окончание обработки остальных обращений.</w:t>
-            </w:r>
-          </w:p>
-          <w:p>
-            <w:r>
-              <w:rPr>
-                <w:b w:val="0"/>
-              </w:rPr>
-              <w:t>Какое действие по письму или сообщению считается началом обработки обращения?</w:t>
-            </w:r>
-          </w:p>
-        </w:tc>
-        <w:tc>
-          <w:tcPr>
-            <w:tcW w:type="dxa" w:w="4422"/>
-            <w:vAlign w:val="top"/>
-          </w:tcPr>
-          <w:p>
-            <w:r/>
-          </w:p>
-        </w:tc>
-      </w:tr>
-      <w:tr>
-        <w:trPr>
-          <w:trHeight w:val="935" w:hRule="atLeast"/>
-          <w:cantSplit/>
-        </w:trPr>
-        <w:tc>
-          <w:tcPr>
-            <w:tcW w:type="dxa" w:w="454"/>
-            <w:vAlign w:val="top"/>
-          </w:tcPr>
-          <w:p>
-            <w:r>
-              <w:t>5</w:t>
-            </w:r>
-          </w:p>
-        </w:tc>
-        <w:tc>
-          <w:tcPr>
-            <w:tcW w:type="dxa" w:w="5216"/>
-            <w:vAlign w:val="top"/>
-          </w:tcPr>
-          <w:p>
-            <w:r>
-              <w:rPr>
-                <w:b/>
-              </w:rPr>
-              <w:t>Передача лида</w:t>
-            </w:r>
-          </w:p>
-          <w:p>
-            <w:r>
-              <w:rPr>
-                <w:b w:val="0"/>
-              </w:rPr>
-              <w:t>Кто обязан передать просроченное обращение другому менеджеру?</w:t>
-            </w:r>
-          </w:p>
-        </w:tc>
-        <w:tc>
-          <w:tcPr>
-            <w:tcW w:type="dxa" w:w="4422"/>
-            <w:vAlign w:val="top"/>
-          </w:tcPr>
-          <w:p>
-            <w:r/>
-          </w:p>
-        </w:tc>
-      </w:tr>
-      <w:tr>
-        <w:trPr>
-          <w:trHeight w:val="935" w:hRule="atLeast"/>
-          <w:cantSplit/>
-        </w:trPr>
-        <w:tc>
-          <w:tcPr>
-            <w:tcW w:type="dxa" w:w="454"/>
-            <w:vAlign w:val="top"/>
-          </w:tcPr>
-          <w:p>
-            <w:r>
-              <w:t>6</w:t>
-            </w:r>
-          </w:p>
-        </w:tc>
-        <w:tc>
-          <w:tcPr>
-            <w:tcW w:type="dxa" w:w="5216"/>
-            <w:vAlign w:val="top"/>
-          </w:tcPr>
-          <w:p>
-            <w:r>
-              <w:rPr>
-                <w:b/>
-              </w:rPr>
-              <w:t>Источники</w:t>
-            </w:r>
-          </w:p>
-          <w:p>
-            <w:r>
-              <w:rPr>
-                <w:b w:val="0"/>
-              </w:rPr>
-              <w:t>Как называем источник обращения с почты сайта в отчётности?</w:t>
-            </w:r>
-          </w:p>
-        </w:tc>
-        <w:tc>
-          <w:tcPr>
-            <w:tcW w:type="dxa" w:w="4422"/>
-            <w:vAlign w:val="top"/>
-          </w:tcPr>
-          <w:p>
-            <w:r/>
-          </w:p>
-        </w:tc>
-      </w:tr>
-      <w:tr>
-        <w:trPr>
-          <w:trHeight w:val="935" w:hRule="atLeast"/>
-          <w:cantSplit/>
-        </w:trPr>
-        <w:tc>
-          <w:tcPr>
-            <w:tcW w:type="dxa" w:w="454"/>
-            <w:vAlign w:val="top"/>
-          </w:tcPr>
-          <w:p>
-            <w:r>
-              <w:t>7</w:t>
-            </w:r>
-          </w:p>
-        </w:tc>
-        <w:tc>
-          <w:tcPr>
-            <w:tcW w:type="dxa" w:w="5216"/>
-            <w:vAlign w:val="top"/>
-          </w:tcPr>
-          <w:p>
-            <w:r>
-              <w:rPr>
-                <w:b/>
-              </w:rPr>
-              <w:t>Статусы лида</w:t>
-            </w:r>
-          </w:p>
-          <w:p>
-            <w:r>
-              <w:rPr>
-                <w:b w:val="0"/>
-              </w:rPr>
-              <w:t>Укажите окончательные названия статусов лида и принятые переходы между ними.</w:t>
-            </w:r>
-          </w:p>
-        </w:tc>
-        <w:tc>
-          <w:tcPr>
-            <w:tcW w:type="dxa" w:w="4422"/>
-            <w:vAlign w:val="top"/>
-          </w:tcPr>
-          <w:p>
-            <w:r/>
-          </w:p>
-        </w:tc>
-      </w:tr>
-      <w:tr>
-        <w:trPr>
-          <w:trHeight w:val="935" w:hRule="atLeast"/>
-          <w:cantSplit/>
-        </w:trPr>
-        <w:tc>
-          <w:tcPr>
-            <w:tcW w:type="dxa" w:w="454"/>
-            <w:vAlign w:val="top"/>
-          </w:tcPr>
-          <w:p>
-            <w:r>
-              <w:t>8</w:t>
-            </w:r>
-          </w:p>
-        </w:tc>
-        <w:tc>
-          <w:tcPr>
-            <w:tcW w:type="dxa" w:w="5216"/>
-            <w:vAlign w:val="top"/>
-          </w:tcPr>
-          <w:p>
-            <w:r>
-              <w:rPr>
-                <w:b/>
-              </w:rPr>
-              <w:t>Нет связи</w:t>
-            </w:r>
-          </w:p>
-          <w:p>
-            <w:r>
-              <w:rPr>
-                <w:b w:val="0"/>
-              </w:rPr>
-              <w:t>Если клиент не отвечает, сколько времени нужно ждать до завершения работы с лидом? Сколько попыток связи нужно сделать?</w:t>
-            </w:r>
-          </w:p>
-        </w:tc>
-        <w:tc>
-          <w:tcPr>
-            <w:tcW w:type="dxa" w:w="4422"/>
-            <w:vAlign w:val="top"/>
-          </w:tcPr>
-          <w:p>
-            <w:r/>
-          </w:p>
-        </w:tc>
-      </w:tr>
-      <w:tr>
-        <w:trPr>
-          <w:trHeight w:val="935" w:hRule="atLeast"/>
-          <w:cantSplit/>
-        </w:trPr>
-        <w:tc>
-          <w:tcPr>
-            <w:tcW w:type="dxa" w:w="454"/>
-            <w:vAlign w:val="top"/>
-          </w:tcPr>
-          <w:p>
-            <w:r>
-              <w:t>9</w:t>
-            </w:r>
-          </w:p>
-        </w:tc>
-        <w:tc>
-          <w:tcPr>
-            <w:tcW w:type="dxa" w:w="5216"/>
-            <w:vAlign w:val="top"/>
-          </w:tcPr>
-          <w:p>
-            <w:r>
-              <w:rPr>
-                <w:b/>
-              </w:rPr>
-              <w:t>Отказ в лидах</w:t>
-            </w:r>
-          </w:p>
-          <w:p>
-            <w:r>
-              <w:rPr>
-                <w:b w:val="0"/>
-              </w:rPr>
-              <w:t>Какие причины завершения работы с живым потенциальным клиентом фиксируем сейчас в лиде?</w:t>
-            </w:r>
-          </w:p>
-        </w:tc>
-        <w:tc>
-          <w:tcPr>
-            <w:tcW w:type="dxa" w:w="4422"/>
-            <w:vAlign w:val="top"/>
-          </w:tcPr>
-          <w:p>
-            <w:r/>
-          </w:p>
-        </w:tc>
-      </w:tr>
-      <w:tr>
-        <w:trPr>
-          <w:trHeight w:val="935" w:hRule="atLeast"/>
-          <w:cantSplit/>
-        </w:trPr>
-        <w:tc>
-          <w:tcPr>
-            <w:tcW w:type="dxa" w:w="454"/>
-            <w:vAlign w:val="top"/>
-          </w:tcPr>
-          <w:p>
-            <w:r>
-              <w:t>10</w:t>
-            </w:r>
-          </w:p>
-        </w:tc>
-        <w:tc>
-          <w:tcPr>
-            <w:tcW w:type="dxa" w:w="5216"/>
-            <w:vAlign w:val="top"/>
-          </w:tcPr>
-          <w:p>
-            <w:r>
-              <w:rPr>
-                <w:b/>
-              </w:rPr>
-              <w:t>Повторное обращение</w:t>
-            </w:r>
-          </w:p>
-          <w:p>
-            <w:r>
-              <w:rPr>
-                <w:b w:val="0"/>
-              </w:rPr>
-              <w:t>Если ранее отказавшийся клиент возвращается с новым обращением, создаём лид или сразу сделку?</w:t>
-            </w:r>
-          </w:p>
-        </w:tc>
-        <w:tc>
-          <w:tcPr>
-            <w:tcW w:type="dxa" w:w="4422"/>
-            <w:vAlign w:val="top"/>
-          </w:tcPr>
-          <w:p>
-            <w:r/>
           </w:p>
         </w:tc>
       </w:tr>
     </w:tbl>
-    <w:p>
-      <w:pPr>
-        <w:spacing w:after="40"/>
-      </w:pPr>
-    </w:p>
-    <w:p>
-      <w:pPr>
-        <w:pStyle w:val="Heading1"/>
-      </w:pPr>
-      <w:r>
-        <w:t>Сделки, доставка и обратная связь</w:t>
-      </w:r>
-    </w:p>
-    <w:tbl>
-      <w:tblPr>
-        <w:tblStyle w:val="TableGrid"/>
-        <w:tblW w:type="auto" w:w="0"/>
-        <w:jc w:val="center"/>
-        <w:tblLayout w:type="fixed"/>
-        <w:tblLook w:firstColumn="1" w:firstRow="1" w:lastColumn="0" w:lastRow="0" w:noHBand="0" w:noVBand="1" w:val="04A0"/>
-      </w:tblPr>
-      <w:tblGrid>
-        <w:gridCol w:w="454"/>
-        <w:gridCol w:w="5216"/>
-        <w:gridCol w:w="4422"/>
-      </w:tblGrid>
-      <w:tr>
-        <w:trPr>
-          <w:tblHeader/>
-        </w:trPr>
-        <w:tc>
-          <w:tcPr>
-            <w:tcW w:type="dxa" w:w="454"/>
-            <w:vAlign w:val="center"/>
-            <w:shd w:fill="F2F2F2"/>
-          </w:tcPr>
-          <w:p>
-            <w:r>
-              <w:rPr>
-                <w:b/>
-              </w:rPr>
-              <w:t>№</w:t>
-            </w:r>
-          </w:p>
-        </w:tc>
-        <w:tc>
-          <w:tcPr>
-            <w:tcW w:type="dxa" w:w="5216"/>
-            <w:vAlign w:val="center"/>
-            <w:shd w:fill="F2F2F2"/>
-          </w:tcPr>
-          <w:p>
-            <w:r>
-              <w:rPr>
-                <w:b/>
-              </w:rPr>
-              <w:t>Вопрос</w:t>
-            </w:r>
-          </w:p>
-        </w:tc>
-        <w:tc>
-          <w:tcPr>
-            <w:tcW w:type="dxa" w:w="4422"/>
-            <w:vAlign w:val="center"/>
-            <w:shd w:fill="F2F2F2"/>
-          </w:tcPr>
-          <w:p>
-            <w:r>
-              <w:rPr>
-                <w:b/>
-              </w:rPr>
-              <w:t>Ответ клиента</w:t>
-            </w:r>
-          </w:p>
-        </w:tc>
-      </w:tr>
-      <w:tr>
-        <w:trPr>
-          <w:trHeight w:val="935" w:hRule="atLeast"/>
-          <w:cantSplit/>
-        </w:trPr>
-        <w:tc>
-          <w:tcPr>
-            <w:tcW w:type="dxa" w:w="454"/>
-            <w:vAlign w:val="top"/>
-          </w:tcPr>
-          <w:p>
-            <w:r>
-              <w:t>11</w:t>
-            </w:r>
-          </w:p>
-        </w:tc>
-        <w:tc>
-          <w:tcPr>
-            <w:tcW w:type="dxa" w:w="5216"/>
-            <w:vAlign w:val="top"/>
-          </w:tcPr>
-          <w:p>
-            <w:r>
-              <w:rPr>
-                <w:b/>
-              </w:rPr>
-              <w:t>Ожидание расчёта</w:t>
-            </w:r>
-          </w:p>
-          <w:p>
-            <w:r>
-              <w:rPr>
-                <w:b w:val="0"/>
-              </w:rPr>
-              <w:t>Через какой срок ожидания ответа клиента по расчёту нужно уведомить менеджера или руководителя?</w:t>
-            </w:r>
-          </w:p>
-        </w:tc>
-        <w:tc>
-          <w:tcPr>
-            <w:tcW w:type="dxa" w:w="4422"/>
-            <w:vAlign w:val="top"/>
-          </w:tcPr>
-          <w:p>
-            <w:r/>
-          </w:p>
-        </w:tc>
-      </w:tr>
-      <w:tr>
-        <w:trPr>
-          <w:trHeight w:val="935" w:hRule="atLeast"/>
-          <w:cantSplit/>
-        </w:trPr>
-        <w:tc>
-          <w:tcPr>
-            <w:tcW w:type="dxa" w:w="454"/>
-            <w:vAlign w:val="top"/>
-          </w:tcPr>
-          <w:p>
-            <w:r>
-              <w:t>12</w:t>
-            </w:r>
-          </w:p>
-        </w:tc>
-        <w:tc>
-          <w:tcPr>
-            <w:tcW w:type="dxa" w:w="5216"/>
-            <w:vAlign w:val="top"/>
-          </w:tcPr>
-          <w:p>
-            <w:r>
-              <w:rPr>
-                <w:b/>
-              </w:rPr>
-              <w:t>Оплачено без скана</w:t>
-            </w:r>
-          </w:p>
-          <w:p>
-            <w:r>
-              <w:rPr>
-                <w:b w:val="0"/>
-              </w:rPr>
-              <w:t>Где ожидает оплаченная сделка, пока не получен скан подписанного договора? Кто отвечает за устранение этой задержки?</w:t>
-            </w:r>
-          </w:p>
-        </w:tc>
-        <w:tc>
-          <w:tcPr>
-            <w:tcW w:type="dxa" w:w="4422"/>
-            <w:vAlign w:val="top"/>
-          </w:tcPr>
-          <w:p>
-            <w:r/>
-          </w:p>
-        </w:tc>
-      </w:tr>
-      <w:tr>
-        <w:trPr>
-          <w:trHeight w:val="935" w:hRule="atLeast"/>
-          <w:cantSplit/>
-        </w:trPr>
-        <w:tc>
-          <w:tcPr>
-            <w:tcW w:type="dxa" w:w="454"/>
-            <w:vAlign w:val="top"/>
-          </w:tcPr>
-          <w:p>
-            <w:r>
-              <w:t>13</w:t>
-            </w:r>
-          </w:p>
-        </w:tc>
-        <w:tc>
-          <w:tcPr>
-            <w:tcW w:type="dxa" w:w="5216"/>
-            <w:vAlign w:val="top"/>
-          </w:tcPr>
-          <w:p>
-            <w:r>
-              <w:rPr>
-                <w:b/>
-              </w:rPr>
-              <w:t>Товар на складе</w:t>
-            </w:r>
-          </w:p>
-          <w:p>
-            <w:r>
-              <w:rPr>
-                <w:b w:val="0"/>
-              </w:rPr>
-              <w:t>Если нужное изделие или товар уже есть на складе, как проходит заказ? Какие действия производства пропускаются? Какие действия закупки пропускаются?</w:t>
-            </w:r>
-          </w:p>
-        </w:tc>
-        <w:tc>
-          <w:tcPr>
-            <w:tcW w:type="dxa" w:w="4422"/>
-            <w:vAlign w:val="top"/>
-          </w:tcPr>
-          <w:p>
-            <w:r/>
-          </w:p>
-        </w:tc>
-      </w:tr>
-      <w:tr>
-        <w:trPr>
-          <w:trHeight w:val="935" w:hRule="atLeast"/>
-          <w:cantSplit/>
-        </w:trPr>
-        <w:tc>
-          <w:tcPr>
-            <w:tcW w:type="dxa" w:w="454"/>
-            <w:vAlign w:val="top"/>
-          </w:tcPr>
-          <w:p>
-            <w:r>
-              <w:t>14</w:t>
-            </w:r>
-          </w:p>
-        </w:tc>
-        <w:tc>
-          <w:tcPr>
-            <w:tcW w:type="dxa" w:w="5216"/>
-            <w:vAlign w:val="top"/>
-          </w:tcPr>
-          <w:p>
-            <w:r>
-              <w:rPr>
-                <w:b/>
-              </w:rPr>
-              <w:t>Закрывающие документы</w:t>
-            </w:r>
-          </w:p>
-          <w:p>
-            <w:r>
-              <w:rPr>
-                <w:b w:val="0"/>
-              </w:rPr>
-              <w:t>Опишите порядок передачи подписанных документов после доставки: от водителя до прикрепления к сделке. Для каждого действия укажите ответственного.</w:t>
-            </w:r>
-          </w:p>
-        </w:tc>
-        <w:tc>
-          <w:tcPr>
-            <w:tcW w:type="dxa" w:w="4422"/>
-            <w:vAlign w:val="top"/>
-          </w:tcPr>
-          <w:p>
-            <w:r/>
-          </w:p>
-        </w:tc>
-      </w:tr>
-      <w:tr>
-        <w:trPr>
-          <w:trHeight w:val="935" w:hRule="atLeast"/>
-          <w:cantSplit/>
-        </w:trPr>
-        <w:tc>
-          <w:tcPr>
-            <w:tcW w:type="dxa" w:w="454"/>
-            <w:vAlign w:val="top"/>
-          </w:tcPr>
-          <w:p>
-            <w:r>
-              <w:t>15</w:t>
-            </w:r>
-          </w:p>
-        </w:tc>
-        <w:tc>
-          <w:tcPr>
-            <w:tcW w:type="dxa" w:w="5216"/>
-            <w:vAlign w:val="top"/>
-          </w:tcPr>
-          <w:p>
-            <w:r>
-              <w:rPr>
-                <w:b/>
-              </w:rPr>
-              <w:t>Доставка</w:t>
-            </w:r>
-          </w:p>
-          <w:p>
-            <w:r>
-              <w:rPr>
-                <w:b w:val="0"/>
-              </w:rPr>
-              <w:t>Кто отвечает за фиксацию факта доставки в сделке?</w:t>
-            </w:r>
-          </w:p>
-        </w:tc>
-        <w:tc>
-          <w:tcPr>
-            <w:tcW w:type="dxa" w:w="4422"/>
-            <w:vAlign w:val="top"/>
-          </w:tcPr>
-          <w:p>
-            <w:r/>
-          </w:p>
-        </w:tc>
-      </w:tr>
-      <w:tr>
-        <w:trPr>
-          <w:trHeight w:val="935" w:hRule="atLeast"/>
-          <w:cantSplit/>
-        </w:trPr>
-        <w:tc>
-          <w:tcPr>
-            <w:tcW w:type="dxa" w:w="454"/>
-            <w:vAlign w:val="top"/>
-          </w:tcPr>
-          <w:p>
-            <w:r>
-              <w:t>16</w:t>
-            </w:r>
-          </w:p>
-        </w:tc>
-        <w:tc>
-          <w:tcPr>
-            <w:tcW w:type="dxa" w:w="5216"/>
-            <w:vAlign w:val="top"/>
-          </w:tcPr>
-          <w:p>
-            <w:r>
-              <w:rPr>
-                <w:b/>
-              </w:rPr>
-              <w:t>Обратная связь</w:t>
-            </w:r>
-          </w:p>
-          <w:p>
-            <w:r>
-              <w:rPr>
-                <w:b w:val="0"/>
-              </w:rPr>
-              <w:t>От какого события считаем сроки звонков после заказа без монтажа?</w:t>
-            </w:r>
-          </w:p>
-        </w:tc>
-        <w:tc>
-          <w:tcPr>
-            <w:tcW w:type="dxa" w:w="4422"/>
-            <w:vAlign w:val="top"/>
-          </w:tcPr>
-          <w:p>
-            <w:r/>
-          </w:p>
-        </w:tc>
-      </w:tr>
-      <w:tr>
-        <w:trPr>
-          <w:trHeight w:val="935" w:hRule="atLeast"/>
-          <w:cantSplit/>
-        </w:trPr>
-        <w:tc>
-          <w:tcPr>
-            <w:tcW w:type="dxa" w:w="454"/>
-            <w:vAlign w:val="top"/>
-          </w:tcPr>
-          <w:p>
-            <w:r>
-              <w:t>17</w:t>
-            </w:r>
-          </w:p>
-        </w:tc>
-        <w:tc>
-          <w:tcPr>
-            <w:tcW w:type="dxa" w:w="5216"/>
-            <w:vAlign w:val="top"/>
-          </w:tcPr>
-          <w:p>
-            <w:r>
-              <w:rPr>
-                <w:b/>
-              </w:rPr>
-              <w:t>Обратная связь</w:t>
-            </w:r>
-          </w:p>
-          <w:p>
-            <w:r>
-              <w:rPr>
-                <w:b w:val="0"/>
-              </w:rPr>
-              <w:t>После завершения каких заказов обязателен звонок: всех или только заказов от определённой суммы? Если действует денежный порог, укажите его.</w:t>
-            </w:r>
-          </w:p>
-        </w:tc>
-        <w:tc>
-          <w:tcPr>
-            <w:tcW w:type="dxa" w:w="4422"/>
-            <w:vAlign w:val="top"/>
-          </w:tcPr>
-          <w:p>
-            <w:r/>
-          </w:p>
-        </w:tc>
-      </w:tr>
-      <w:tr>
-        <w:trPr>
-          <w:trHeight w:val="935" w:hRule="atLeast"/>
-          <w:cantSplit/>
-        </w:trPr>
-        <w:tc>
-          <w:tcPr>
-            <w:tcW w:type="dxa" w:w="454"/>
-            <w:vAlign w:val="top"/>
-          </w:tcPr>
-          <w:p>
-            <w:r>
-              <w:t>18</w:t>
-            </w:r>
-          </w:p>
-        </w:tc>
-        <w:tc>
-          <w:tcPr>
-            <w:tcW w:type="dxa" w:w="5216"/>
-            <w:vAlign w:val="top"/>
-          </w:tcPr>
-          <w:p>
-            <w:r>
-              <w:rPr>
-                <w:b/>
-              </w:rPr>
-              <w:t>Отказ в сделках</w:t>
-            </w:r>
-          </w:p>
-          <w:p>
-            <w:r>
-              <w:rPr>
-                <w:b w:val="0"/>
-              </w:rPr>
-              <w:t>Какие причины отказа до оплаты фиксируем в текущей сделке?</w:t>
-            </w:r>
-          </w:p>
-        </w:tc>
-        <w:tc>
-          <w:tcPr>
-            <w:tcW w:type="dxa" w:w="4422"/>
-            <w:vAlign w:val="top"/>
-          </w:tcPr>
-          <w:p>
-            <w:r/>
-          </w:p>
-        </w:tc>
-      </w:tr>
-    </w:tbl>
-    <w:p>
-      <w:pPr>
-        <w:spacing w:after="40"/>
-      </w:pPr>
-    </w:p>
     <w:p>
       <w:pPr>
         <w:pStyle w:val="Heading1"/>
@@ -1053,14 +200,13 @@
       <w:tblPr>
         <w:tblStyle w:val="TableGrid"/>
         <w:tblW w:type="auto" w:w="0"/>
-        <w:jc w:val="center"/>
         <w:tblLayout w:type="fixed"/>
         <w:tblLook w:firstColumn="1" w:firstRow="1" w:lastColumn="0" w:lastRow="0" w:noHBand="0" w:noVBand="1" w:val="04A0"/>
       </w:tblPr>
       <w:tblGrid>
-        <w:gridCol w:w="454"/>
-        <w:gridCol w:w="5216"/>
-        <w:gridCol w:w="4422"/>
+        <w:gridCol w:w="3364"/>
+        <w:gridCol w:w="3364"/>
+        <w:gridCol w:w="3364"/>
       </w:tblGrid>
       <w:tr>
         <w:trPr>
@@ -1069,14 +215,9 @@
         <w:tc>
           <w:tcPr>
             <w:tcW w:type="dxa" w:w="454"/>
-            <w:vAlign w:val="center"/>
-            <w:shd w:fill="F2F2F2"/>
           </w:tcPr>
           <w:p>
             <w:r>
-              <w:rPr>
-                <w:b/>
-              </w:rPr>
               <w:t>№</w:t>
             </w:r>
           </w:p>
@@ -1084,14 +225,9 @@
         <w:tc>
           <w:tcPr>
             <w:tcW w:type="dxa" w:w="5216"/>
-            <w:vAlign w:val="center"/>
-            <w:shd w:fill="F2F2F2"/>
           </w:tcPr>
           <w:p>
             <w:r>
-              <w:rPr>
-                <w:b/>
-              </w:rPr>
               <w:t>Вопрос</w:t>
             </w:r>
           </w:p>
@@ -1099,14 +235,9 @@
         <w:tc>
           <w:tcPr>
             <w:tcW w:type="dxa" w:w="4422"/>
-            <w:vAlign w:val="center"/>
-            <w:shd w:fill="F2F2F2"/>
           </w:tcPr>
           <w:p>
             <w:r>
-              <w:rPr>
-                <w:b/>
-              </w:rPr>
               <w:t>Ответ клиента</w:t>
             </w:r>
           </w:p>
@@ -1114,222 +245,102 @@
       </w:tr>
       <w:tr>
         <w:trPr>
-          <w:trHeight w:val="935" w:hRule="atLeast"/>
           <w:cantSplit/>
         </w:trPr>
         <w:tc>
           <w:tcPr>
             <w:tcW w:type="dxa" w:w="454"/>
-            <w:vAlign w:val="top"/>
           </w:tcPr>
           <w:p>
             <w:r>
-              <w:t>19</w:t>
+              <w:t>4</w:t>
             </w:r>
           </w:p>
         </w:tc>
         <w:tc>
           <w:tcPr>
             <w:tcW w:type="dxa" w:w="5216"/>
-            <w:vAlign w:val="top"/>
           </w:tcPr>
           <w:p>
             <w:r>
-              <w:rPr>
-                <w:b/>
-              </w:rPr>
-              <w:t>Оплата замера</w:t>
-            </w:r>
-          </w:p>
-          <w:p>
-            <w:r>
-              <w:rPr>
-                <w:b w:val="0"/>
-              </w:rPr>
-              <w:t>Укажите действующее правило оплаты первичного замера: платный он или бесплатный? Если платный, когда его оплачивают? Зачитывается ли оплата замера в стоимость заказа?</w:t>
+              <w:t>Стоимость замера в заказе</w:t>
+              <w:br/>
+              <w:t>Оплата замера уменьшает сумму к оплате за последующий заказ или замер оплачивается отдельно от заказа?</w:t>
             </w:r>
           </w:p>
         </w:tc>
         <w:tc>
           <w:tcPr>
             <w:tcW w:type="dxa" w:w="4422"/>
-            <w:vAlign w:val="top"/>
           </w:tcPr>
           <w:p>
-            <w:r/>
+            <w:r>
+              <w:br/>
+              <w:br/>
+              <w:br/>
+            </w:r>
           </w:p>
         </w:tc>
       </w:tr>
       <w:tr>
         <w:trPr>
-          <w:trHeight w:val="935" w:hRule="atLeast"/>
           <w:cantSplit/>
         </w:trPr>
         <w:tc>
           <w:tcPr>
             <w:tcW w:type="dxa" w:w="454"/>
-            <w:vAlign w:val="top"/>
           </w:tcPr>
           <w:p>
             <w:r>
-              <w:t>20</w:t>
+              <w:t>5</w:t>
             </w:r>
           </w:p>
         </w:tc>
         <w:tc>
           <w:tcPr>
             <w:tcW w:type="dxa" w:w="5216"/>
-            <w:vAlign w:val="top"/>
           </w:tcPr>
           <w:p>
             <w:r>
-              <w:rPr>
-                <w:b/>
-              </w:rPr>
-              <w:t>Оплата замера</w:t>
-            </w:r>
-          </w:p>
-          <w:p>
-            <w:r>
-              <w:rPr>
-                <w:b w:val="0"/>
-              </w:rPr>
-              <w:t>Заполните этот пункт, только если по ответу на пункт 19 разрешены бесплатные исключения. Кто вправе разрешить бесплатный замер? Если такие исключения не разрешены, укажите «Не применяется».</w:t>
+              <w:t>Понижающий коэффициент</w:t>
+              <w:br/>
+              <w:t>Что меняет понижающий коэффициент в расчёте заказа и в каких случаях его применяют? Если сейчас его не используют, напишите «Не применяется».</w:t>
             </w:r>
           </w:p>
         </w:tc>
         <w:tc>
           <w:tcPr>
             <w:tcW w:type="dxa" w:w="4422"/>
-            <w:vAlign w:val="top"/>
-          </w:tcPr>
-          <w:p>
-            <w:r/>
-          </w:p>
-        </w:tc>
-      </w:tr>
-      <w:tr>
-        <w:trPr>
-          <w:trHeight w:val="935" w:hRule="atLeast"/>
-          <w:cantSplit/>
-        </w:trPr>
-        <w:tc>
-          <w:tcPr>
-            <w:tcW w:type="dxa" w:w="454"/>
-            <w:vAlign w:val="top"/>
           </w:tcPr>
           <w:p>
             <w:r>
-              <w:t>21</w:t>
+              <w:br/>
+              <w:br/>
+              <w:br/>
             </w:r>
-          </w:p>
-        </w:tc>
-        <w:tc>
-          <w:tcPr>
-            <w:tcW w:type="dxa" w:w="5216"/>
-            <w:vAlign w:val="top"/>
-          </w:tcPr>
-          <w:p>
-            <w:r>
-              <w:rPr>
-                <w:b/>
-              </w:rPr>
-              <w:t>Повторный замер</w:t>
-            </w:r>
-          </w:p>
-          <w:p>
-            <w:r>
-              <w:rPr>
-                <w:b w:val="0"/>
-              </w:rPr>
-              <w:t>В каких случаях назначается повторный замер? Кто принимает это решение?</w:t>
-            </w:r>
-          </w:p>
-        </w:tc>
-        <w:tc>
-          <w:tcPr>
-            <w:tcW w:type="dxa" w:w="4422"/>
-            <w:vAlign w:val="top"/>
-          </w:tcPr>
-          <w:p>
-            <w:r/>
-          </w:p>
-        </w:tc>
-      </w:tr>
-      <w:tr>
-        <w:trPr>
-          <w:trHeight w:val="935" w:hRule="atLeast"/>
-          <w:cantSplit/>
-        </w:trPr>
-        <w:tc>
-          <w:tcPr>
-            <w:tcW w:type="dxa" w:w="454"/>
-            <w:vAlign w:val="top"/>
-          </w:tcPr>
-          <w:p>
-            <w:r>
-              <w:t>22</w:t>
-            </w:r>
-          </w:p>
-        </w:tc>
-        <w:tc>
-          <w:tcPr>
-            <w:tcW w:type="dxa" w:w="5216"/>
-            <w:vAlign w:val="top"/>
-          </w:tcPr>
-          <w:p>
-            <w:r>
-              <w:rPr>
-                <w:b/>
-              </w:rPr>
-              <w:t>Расчёт цены</w:t>
-            </w:r>
-          </w:p>
-          <w:p>
-            <w:r>
-              <w:rPr>
-                <w:b w:val="0"/>
-              </w:rPr>
-              <w:t>Применяются ли сейчас понижающие коэффициенты? Если да, укажите действующее правило и кто разрешает их применение.</w:t>
-            </w:r>
-          </w:p>
-        </w:tc>
-        <w:tc>
-          <w:tcPr>
-            <w:tcW w:type="dxa" w:w="4422"/>
-            <w:vAlign w:val="top"/>
-          </w:tcPr>
-          <w:p>
-            <w:r/>
           </w:p>
         </w:tc>
       </w:tr>
     </w:tbl>
     <w:p>
       <w:pPr>
-        <w:spacing w:after="40"/>
-      </w:pPr>
-    </w:p>
-    <w:p>
-      <w:pPr>
         <w:pStyle w:val="Heading1"/>
       </w:pPr>
       <w:r>
-        <w:t>Документы и оплата</w:t>
+        <w:t>Названия документов</w:t>
       </w:r>
     </w:p>
     <w:tbl>
       <w:tblPr>
         <w:tblStyle w:val="TableGrid"/>
         <w:tblW w:type="auto" w:w="0"/>
-        <w:jc w:val="center"/>
         <w:tblLayout w:type="fixed"/>
         <w:tblLook w:firstColumn="1" w:firstRow="1" w:lastColumn="0" w:lastRow="0" w:noHBand="0" w:noVBand="1" w:val="04A0"/>
       </w:tblPr>
       <w:tblGrid>
-        <w:gridCol w:w="454"/>
-        <w:gridCol w:w="5216"/>
-        <w:gridCol w:w="4422"/>
+        <w:gridCol w:w="3364"/>
+        <w:gridCol w:w="3364"/>
+        <w:gridCol w:w="3364"/>
       </w:tblGrid>
       <w:tr>
         <w:trPr>
@@ -1338,14 +349,9 @@
         <w:tc>
           <w:tcPr>
             <w:tcW w:type="dxa" w:w="454"/>
-            <w:vAlign w:val="center"/>
-            <w:shd w:fill="F2F2F2"/>
           </w:tcPr>
           <w:p>
             <w:r>
-              <w:rPr>
-                <w:b/>
-              </w:rPr>
               <w:t>№</w:t>
             </w:r>
           </w:p>
@@ -1353,14 +359,9 @@
         <w:tc>
           <w:tcPr>
             <w:tcW w:type="dxa" w:w="5216"/>
-            <w:vAlign w:val="center"/>
-            <w:shd w:fill="F2F2F2"/>
           </w:tcPr>
           <w:p>
             <w:r>
-              <w:rPr>
-                <w:b/>
-              </w:rPr>
               <w:t>Вопрос</w:t>
             </w:r>
           </w:p>
@@ -1368,14 +369,9 @@
         <w:tc>
           <w:tcPr>
             <w:tcW w:type="dxa" w:w="4422"/>
-            <w:vAlign w:val="center"/>
-            <w:shd w:fill="F2F2F2"/>
           </w:tcPr>
           <w:p>
             <w:r>
-              <w:rPr>
-                <w:b/>
-              </w:rPr>
               <w:t>Ответ клиента</w:t>
             </w:r>
           </w:p>
@@ -1383,222 +379,102 @@
       </w:tr>
       <w:tr>
         <w:trPr>
-          <w:trHeight w:val="935" w:hRule="atLeast"/>
           <w:cantSplit/>
         </w:trPr>
         <w:tc>
           <w:tcPr>
             <w:tcW w:type="dxa" w:w="454"/>
-            <w:vAlign w:val="top"/>
           </w:tcPr>
           <w:p>
             <w:r>
-              <w:t>23</w:t>
+              <w:t>6</w:t>
             </w:r>
           </w:p>
         </w:tc>
         <w:tc>
           <w:tcPr>
             <w:tcW w:type="dxa" w:w="5216"/>
-            <w:vAlign w:val="top"/>
           </w:tcPr>
           <w:p>
             <w:r>
-              <w:rPr>
-                <w:b/>
-              </w:rPr>
-              <w:t>Документы</w:t>
-            </w:r>
-          </w:p>
-          <w:p>
-            <w:r>
-              <w:rPr>
-                <w:b w:val="0"/>
-              </w:rPr>
-              <w:t>Что означает «ПР» в ваших материалах? Укажите документ или пример.</w:t>
+              <w:t>ПР</w:t>
+              <w:br/>
+              <w:t>Как полностью называется документ «ПР» из комплекта к договору? Если это прежнее название, укажите, какой документ используется сейчас.</w:t>
             </w:r>
           </w:p>
         </w:tc>
         <w:tc>
           <w:tcPr>
             <w:tcW w:type="dxa" w:w="4422"/>
-            <w:vAlign w:val="top"/>
           </w:tcPr>
           <w:p>
-            <w:r/>
+            <w:r>
+              <w:br/>
+              <w:br/>
+              <w:br/>
+            </w:r>
           </w:p>
         </w:tc>
       </w:tr>
       <w:tr>
         <w:trPr>
-          <w:trHeight w:val="935" w:hRule="atLeast"/>
           <w:cantSplit/>
         </w:trPr>
         <w:tc>
           <w:tcPr>
             <w:tcW w:type="dxa" w:w="454"/>
-            <w:vAlign w:val="top"/>
           </w:tcPr>
           <w:p>
             <w:r>
-              <w:t>24</w:t>
+              <w:t>7</w:t>
             </w:r>
           </w:p>
         </w:tc>
         <w:tc>
           <w:tcPr>
             <w:tcW w:type="dxa" w:w="5216"/>
-            <w:vAlign w:val="top"/>
           </w:tcPr>
           <w:p>
             <w:r>
-              <w:rPr>
-                <w:b/>
-              </w:rPr>
-              <w:t>Документы</w:t>
-            </w:r>
-          </w:p>
-          <w:p>
-            <w:r>
-              <w:rPr>
-                <w:b w:val="0"/>
-              </w:rPr>
-              <w:t>Что означает «ПСР» в ваших материалах? Укажите документ или пример.</w:t>
+              <w:t>ПСР</w:t>
+              <w:br/>
+              <w:t>Как полностью называется документ «ПСР» из комплекта к договору? Если это прежнее название, укажите, какой документ используется сейчас.</w:t>
             </w:r>
           </w:p>
         </w:tc>
         <w:tc>
           <w:tcPr>
             <w:tcW w:type="dxa" w:w="4422"/>
-            <w:vAlign w:val="top"/>
-          </w:tcPr>
-          <w:p>
-            <w:r/>
-          </w:p>
-        </w:tc>
-      </w:tr>
-      <w:tr>
-        <w:trPr>
-          <w:trHeight w:val="935" w:hRule="atLeast"/>
-          <w:cantSplit/>
-        </w:trPr>
-        <w:tc>
-          <w:tcPr>
-            <w:tcW w:type="dxa" w:w="454"/>
-            <w:vAlign w:val="top"/>
           </w:tcPr>
           <w:p>
             <w:r>
-              <w:t>25</w:t>
+              <w:br/>
+              <w:br/>
+              <w:br/>
             </w:r>
-          </w:p>
-        </w:tc>
-        <w:tc>
-          <w:tcPr>
-            <w:tcW w:type="dxa" w:w="5216"/>
-            <w:vAlign w:val="top"/>
-          </w:tcPr>
-          <w:p>
-            <w:r>
-              <w:rPr>
-                <w:b/>
-              </w:rPr>
-              <w:t>Плательщик</w:t>
-            </w:r>
-          </w:p>
-          <w:p>
-            <w:r>
-              <w:rPr>
-                <w:b w:val="0"/>
-              </w:rPr>
-              <w:t>Если плательщик и заказчик — разные организации, кто указан заказчиком в договоре? Кому выставляют счёт?</w:t>
-            </w:r>
-          </w:p>
-        </w:tc>
-        <w:tc>
-          <w:tcPr>
-            <w:tcW w:type="dxa" w:w="4422"/>
-            <w:vAlign w:val="top"/>
-          </w:tcPr>
-          <w:p>
-            <w:r/>
-          </w:p>
-        </w:tc>
-      </w:tr>
-      <w:tr>
-        <w:trPr>
-          <w:trHeight w:val="935" w:hRule="atLeast"/>
-          <w:cantSplit/>
-        </w:trPr>
-        <w:tc>
-          <w:tcPr>
-            <w:tcW w:type="dxa" w:w="454"/>
-            <w:vAlign w:val="top"/>
-          </w:tcPr>
-          <w:p>
-            <w:r>
-              <w:t>26</w:t>
-            </w:r>
-          </w:p>
-        </w:tc>
-        <w:tc>
-          <w:tcPr>
-            <w:tcW w:type="dxa" w:w="5216"/>
-            <w:vAlign w:val="top"/>
-          </w:tcPr>
-          <w:p>
-            <w:r>
-              <w:rPr>
-                <w:b/>
-              </w:rPr>
-              <w:t>Переплата</w:t>
-            </w:r>
-          </w:p>
-          <w:p>
-            <w:r>
-              <w:rPr>
-                <w:b w:val="0"/>
-              </w:rPr>
-              <w:t>Кто принимает решение о переплате? Как её урегулируют с клиентом?</w:t>
-            </w:r>
-          </w:p>
-        </w:tc>
-        <w:tc>
-          <w:tcPr>
-            <w:tcW w:type="dxa" w:w="4422"/>
-            <w:vAlign w:val="top"/>
-          </w:tcPr>
-          <w:p>
-            <w:r/>
           </w:p>
         </w:tc>
       </w:tr>
     </w:tbl>
     <w:p>
       <w:pPr>
-        <w:spacing w:after="40"/>
-      </w:pPr>
-    </w:p>
-    <w:p>
-      <w:pPr>
         <w:pStyle w:val="Heading1"/>
       </w:pPr>
       <w:r>
-        <w:t>Карточки и создание лида</w:t>
+        <w:t>Структура карточек</w:t>
       </w:r>
     </w:p>
     <w:tbl>
       <w:tblPr>
         <w:tblStyle w:val="TableGrid"/>
         <w:tblW w:type="auto" w:w="0"/>
-        <w:jc w:val="center"/>
         <w:tblLayout w:type="fixed"/>
         <w:tblLook w:firstColumn="1" w:firstRow="1" w:lastColumn="0" w:lastRow="0" w:noHBand="0" w:noVBand="1" w:val="04A0"/>
       </w:tblPr>
       <w:tblGrid>
-        <w:gridCol w:w="454"/>
-        <w:gridCol w:w="5216"/>
-        <w:gridCol w:w="4422"/>
+        <w:gridCol w:w="3364"/>
+        <w:gridCol w:w="3364"/>
+        <w:gridCol w:w="3364"/>
       </w:tblGrid>
       <w:tr>
         <w:trPr>
@@ -1607,14 +483,9 @@
         <w:tc>
           <w:tcPr>
             <w:tcW w:type="dxa" w:w="454"/>
-            <w:vAlign w:val="center"/>
-            <w:shd w:fill="F2F2F2"/>
           </w:tcPr>
           <w:p>
             <w:r>
-              <w:rPr>
-                <w:b/>
-              </w:rPr>
               <w:t>№</w:t>
             </w:r>
           </w:p>
@@ -1622,14 +493,9 @@
         <w:tc>
           <w:tcPr>
             <w:tcW w:type="dxa" w:w="5216"/>
-            <w:vAlign w:val="center"/>
-            <w:shd w:fill="F2F2F2"/>
           </w:tcPr>
           <w:p>
             <w:r>
-              <w:rPr>
-                <w:b/>
-              </w:rPr>
               <w:t>Вопрос</w:t>
             </w:r>
           </w:p>
@@ -1637,14 +503,9 @@
         <w:tc>
           <w:tcPr>
             <w:tcW w:type="dxa" w:w="4422"/>
-            <w:vAlign w:val="center"/>
-            <w:shd w:fill="F2F2F2"/>
           </w:tcPr>
           <w:p>
             <w:r>
-              <w:rPr>
-                <w:b/>
-              </w:rPr>
               <w:t>Ответ клиента</w:t>
             </w:r>
           </w:p>
@@ -1652,106 +513,44 @@
       </w:tr>
       <w:tr>
         <w:trPr>
-          <w:trHeight w:val="935" w:hRule="atLeast"/>
           <w:cantSplit/>
         </w:trPr>
         <w:tc>
           <w:tcPr>
             <w:tcW w:type="dxa" w:w="454"/>
-            <w:vAlign w:val="top"/>
           </w:tcPr>
           <w:p>
             <w:r>
-              <w:t>27</w:t>
+              <w:t>8</w:t>
             </w:r>
           </w:p>
         </w:tc>
         <w:tc>
           <w:tcPr>
             <w:tcW w:type="dxa" w:w="5216"/>
-            <w:vAlign w:val="top"/>
           </w:tcPr>
           <w:p>
             <w:r>
-              <w:rPr>
-                <w:b/>
-              </w:rPr>
-              <w:t>Структура карточек</w:t>
-            </w:r>
-          </w:p>
-          <w:p>
-            <w:r>
-              <w:rPr>
-                <w:b w:val="0"/>
-              </w:rPr>
-              <w:t>Сначала используем уже переданную интегратору структуру карточек лида и клиента: укажите этот документ, повторно отправлять его не нужно. Если документ ещё не передан, предоставьте обещанную структуру с обязательными полями для перевода лида в сделку.</w:t>
+              <w:t>Обещанная структура карточек</w:t>
+              <w:br/>
+              <w:t>Укажите документ со структурой карточек лида и клиента, о котором договорились на встрече. Если он уже передан, повторно отправлять его не нужно. Если ещё не передан, приложите его.</w:t>
             </w:r>
           </w:p>
         </w:tc>
         <w:tc>
           <w:tcPr>
             <w:tcW w:type="dxa" w:w="4422"/>
-            <w:vAlign w:val="top"/>
-          </w:tcPr>
-          <w:p>
-            <w:r/>
-          </w:p>
-        </w:tc>
-      </w:tr>
-      <w:tr>
-        <w:trPr>
-          <w:trHeight w:val="935" w:hRule="atLeast"/>
-          <w:cantSplit/>
-        </w:trPr>
-        <w:tc>
-          <w:tcPr>
-            <w:tcW w:type="dxa" w:w="454"/>
-            <w:vAlign w:val="top"/>
           </w:tcPr>
           <w:p>
             <w:r>
-              <w:t>28</w:t>
+              <w:br/>
+              <w:br/>
+              <w:br/>
             </w:r>
-          </w:p>
-        </w:tc>
-        <w:tc>
-          <w:tcPr>
-            <w:tcW w:type="dxa" w:w="5216"/>
-            <w:vAlign w:val="top"/>
-          </w:tcPr>
-          <w:p>
-            <w:r>
-              <w:rPr>
-                <w:b/>
-              </w:rPr>
-              <w:t>Создание лида</w:t>
-            </w:r>
-          </w:p>
-          <w:p>
-            <w:r>
-              <w:rPr>
-                <w:b w:val="0"/>
-              </w:rPr>
-              <w:t>Укажите правило создания лида отдельно для звонков, писем и обращений с сайта: он должен появляться сразу автоматически или после ручного ввода менеджером?</w:t>
-            </w:r>
-          </w:p>
-        </w:tc>
-        <w:tc>
-          <w:tcPr>
-            <w:tcW w:type="dxa" w:w="4422"/>
-            <w:vAlign w:val="top"/>
-          </w:tcPr>
-          <w:p>
-            <w:r/>
           </w:p>
         </w:tc>
       </w:tr>
     </w:tbl>
-    <w:p>
-      <w:pPr>
-        <w:spacing w:after="40"/>
-      </w:pPr>
-    </w:p>
     <w:sectPr>
       <w:footerReference w:type="default" r:id="rId9"/>
       <w:pgSz w:w="11906" w:h="16838"/>

</xml_diff>

<commit_message>
docs: finish client clarification form and align survey cards
ТЗ: docs/tz/TZ-DOCS-DELIVERY.md#U
Atom: eurosteklo-a58
</commit_message>
<xml_diff>
--- a/docs/review/2026-10-05-consistency/Евростекло-уточнение-процесса.docx
+++ b/docs/review/2026-10-05-consistency/Евростекло-уточнение-процесса.docx
@@ -12,7 +12,7 @@
     </w:p>
     <w:p>
       <w:r>
-        <w:t>Впишите ответ рядом с каждым вопросом. Если приложенный документ уже содержит ответ, укажите его название и нужный раздел — повторять описание не требуется. Вопросы с выбором варианта требуют указать этот вариант; одного «да» недостаточно. Если правило не установлено или не применяется, так и напишите. Пустая ячейка не означает согласия.</w:t>
+        <w:t>Пожалуйста, заполните только колонку «Ответ клиента». В вопросах уточняются оставшиеся решения и неоднозначные места; уже полученные ответы повторно не запрашиваются. Укажите конкретное правило, должность, срок или документ — в зависимости от вопроса. Если пункт не применяется, напишите это. Если решение пока не принято, укажите, кто его согласует.</w:t>
       </w:r>
     </w:p>
     <w:p>
@@ -20,7 +20,7 @@
         <w:pStyle w:val="Heading1"/>
       </w:pPr>
       <w:r>
-        <w:t>Сделки и обратная связь</w:t>
+        <w:t>Контроль сделки и обратная связь</w:t>
       </w:r>
     </w:p>
     <w:tbl>
@@ -31,9 +31,9 @@
         <w:tblLook w:firstColumn="1" w:firstRow="1" w:lastColumn="0" w:lastRow="0" w:noHBand="0" w:noVBand="1" w:val="04A0"/>
       </w:tblPr>
       <w:tblGrid>
-        <w:gridCol w:w="3364"/>
-        <w:gridCol w:w="3364"/>
-        <w:gridCol w:w="3364"/>
+        <w:gridCol w:w="454"/>
+        <w:gridCol w:w="5216"/>
+        <w:gridCol w:w="4422"/>
       </w:tblGrid>
       <w:tr>
         <w:trPr>
@@ -41,7 +41,7 @@
         </w:trPr>
         <w:tc>
           <w:tcPr>
-            <w:tcW w:type="dxa" w:w="454"/>
+            <w:tcW w:type="dxa" w:w="3364"/>
           </w:tcPr>
           <w:p>
             <w:r>
@@ -51,7 +51,7 @@
         </w:tc>
         <w:tc>
           <w:tcPr>
-            <w:tcW w:type="dxa" w:w="5216"/>
+            <w:tcW w:type="dxa" w:w="3364"/>
           </w:tcPr>
           <w:p>
             <w:r>
@@ -61,7 +61,7 @@
         </w:tc>
         <w:tc>
           <w:tcPr>
-            <w:tcW w:type="dxa" w:w="4422"/>
+            <w:tcW w:type="dxa" w:w="3364"/>
           </w:tcPr>
           <w:p>
             <w:r>
@@ -90,9 +90,7 @@
           </w:tcPr>
           <w:p>
             <w:r>
-              <w:t>Ожидание ответа по расчёту</w:t>
-              <w:br/>
-              <w:t>Сколько дней без ответа клиента на стадии «Предварительный расчёт» должно пройти, прежде чем руководитель отдела продаж получит задачу разобраться со сделкой? Укажите, рабочие это дни или календарные.</w:t>
+              <w:t>Ожидание ответа по расчётуСколько дней без ответа клиента на стадии «Предварительный расчёт» должно пройти, прежде чем руководитель отдела продаж получит задачу разобраться со сделкой? Укажите, рабочие это дни или календарные.</w:t>
             </w:r>
           </w:p>
         </w:tc>
@@ -101,11 +99,7 @@
             <w:tcW w:type="dxa" w:w="4422"/>
           </w:tcPr>
           <w:p>
-            <w:r>
-              <w:br/>
-              <w:br/>
-              <w:br/>
-            </w:r>
+            <w:r/>
           </w:p>
         </w:tc>
       </w:tr>
@@ -129,9 +123,7 @@
           </w:tcPr>
           <w:p>
             <w:r>
-              <w:t>Звонки после заказа без монтажа</w:t>
-              <w:br/>
-              <w:t>От какой даты отсчитываем сроки звонков клиенту, если заказ выполнен без монтажа?</w:t>
+              <w:t>Звонки после заказа без монтажаОт какой даты отсчитываем сроки звонков клиенту, если заказ выполнен без монтажа?</w:t>
             </w:r>
           </w:p>
         </w:tc>
@@ -140,11 +132,7 @@
             <w:tcW w:type="dxa" w:w="4422"/>
           </w:tcPr>
           <w:p>
-            <w:r>
-              <w:br/>
-              <w:br/>
-              <w:br/>
-            </w:r>
+            <w:r/>
           </w:p>
         </w:tc>
       </w:tr>
@@ -168,9 +156,7 @@
           </w:tcPr>
           <w:p>
             <w:r>
-              <w:t>Сумма заказа для звонков</w:t>
-              <w:br/>
-              <w:t>Какую минимальную сумму заказа устанавливаем для звонков по обратной связи? Если ограничение по сумме не нужно, напишите «Звоним всем».</w:t>
+              <w:t>Сумма заказа для звонковКакую минимальную сумму заказа устанавливаем для звонков по обратной связи? Если ограничение по сумме не нужно, напишите «Звоним всем».</w:t>
             </w:r>
           </w:p>
         </w:tc>
@@ -179,11 +165,7 @@
             <w:tcW w:type="dxa" w:w="4422"/>
           </w:tcPr>
           <w:p>
-            <w:r>
-              <w:br/>
-              <w:br/>
-              <w:br/>
-            </w:r>
+            <w:r/>
           </w:p>
         </w:tc>
       </w:tr>
@@ -204,9 +186,9 @@
         <w:tblLook w:firstColumn="1" w:firstRow="1" w:lastColumn="0" w:lastRow="0" w:noHBand="0" w:noVBand="1" w:val="04A0"/>
       </w:tblPr>
       <w:tblGrid>
-        <w:gridCol w:w="3364"/>
-        <w:gridCol w:w="3364"/>
-        <w:gridCol w:w="3364"/>
+        <w:gridCol w:w="454"/>
+        <w:gridCol w:w="5216"/>
+        <w:gridCol w:w="4422"/>
       </w:tblGrid>
       <w:tr>
         <w:trPr>
@@ -214,7 +196,7 @@
         </w:trPr>
         <w:tc>
           <w:tcPr>
-            <w:tcW w:type="dxa" w:w="454"/>
+            <w:tcW w:type="dxa" w:w="3364"/>
           </w:tcPr>
           <w:p>
             <w:r>
@@ -224,7 +206,7 @@
         </w:tc>
         <w:tc>
           <w:tcPr>
-            <w:tcW w:type="dxa" w:w="5216"/>
+            <w:tcW w:type="dxa" w:w="3364"/>
           </w:tcPr>
           <w:p>
             <w:r>
@@ -234,7 +216,7 @@
         </w:tc>
         <w:tc>
           <w:tcPr>
-            <w:tcW w:type="dxa" w:w="4422"/>
+            <w:tcW w:type="dxa" w:w="3364"/>
           </w:tcPr>
           <w:p>
             <w:r>
@@ -263,9 +245,7 @@
           </w:tcPr>
           <w:p>
             <w:r>
-              <w:t>Стоимость замера в заказе</w:t>
-              <w:br/>
-              <w:t>Оплата замера уменьшает сумму к оплате за последующий заказ или замер оплачивается отдельно от заказа?</w:t>
+              <w:t>Стоимость замера в заказеОплата замера уменьшает сумму к оплате за последующий заказ или замер оплачивается отдельно от заказа?</w:t>
             </w:r>
           </w:p>
         </w:tc>
@@ -274,11 +254,7 @@
             <w:tcW w:type="dxa" w:w="4422"/>
           </w:tcPr>
           <w:p>
-            <w:r>
-              <w:br/>
-              <w:br/>
-              <w:br/>
-            </w:r>
+            <w:r/>
           </w:p>
         </w:tc>
       </w:tr>
@@ -302,9 +278,7 @@
           </w:tcPr>
           <w:p>
             <w:r>
-              <w:t>Понижающий коэффициент</w:t>
-              <w:br/>
-              <w:t>Что меняет понижающий коэффициент в расчёте заказа и в каких случаях его применяют? Если сейчас его не используют, напишите «Не применяется».</w:t>
+              <w:t>Понижающий коэффициентЧто меняет понижающий коэффициент в расчёте заказа и в каких случаях его применяют? Если сейчас его не используют, напишите «Не применяется».</w:t>
             </w:r>
           </w:p>
         </w:tc>
@@ -313,11 +287,7 @@
             <w:tcW w:type="dxa" w:w="4422"/>
           </w:tcPr>
           <w:p>
-            <w:r>
-              <w:br/>
-              <w:br/>
-              <w:br/>
-            </w:r>
+            <w:r/>
           </w:p>
         </w:tc>
       </w:tr>
@@ -327,7 +297,7 @@
         <w:pStyle w:val="Heading1"/>
       </w:pPr>
       <w:r>
-        <w:t>Названия документов</w:t>
+        <w:t>Документы и завершение работ</w:t>
       </w:r>
     </w:p>
     <w:tbl>
@@ -338,9 +308,9 @@
         <w:tblLook w:firstColumn="1" w:firstRow="1" w:lastColumn="0" w:lastRow="0" w:noHBand="0" w:noVBand="1" w:val="04A0"/>
       </w:tblPr>
       <w:tblGrid>
-        <w:gridCol w:w="3364"/>
-        <w:gridCol w:w="3364"/>
-        <w:gridCol w:w="3364"/>
+        <w:gridCol w:w="454"/>
+        <w:gridCol w:w="5216"/>
+        <w:gridCol w:w="4422"/>
       </w:tblGrid>
       <w:tr>
         <w:trPr>
@@ -348,7 +318,7 @@
         </w:trPr>
         <w:tc>
           <w:tcPr>
-            <w:tcW w:type="dxa" w:w="454"/>
+            <w:tcW w:type="dxa" w:w="3364"/>
           </w:tcPr>
           <w:p>
             <w:r>
@@ -358,7 +328,7 @@
         </w:tc>
         <w:tc>
           <w:tcPr>
-            <w:tcW w:type="dxa" w:w="5216"/>
+            <w:tcW w:type="dxa" w:w="3364"/>
           </w:tcPr>
           <w:p>
             <w:r>
@@ -368,7 +338,7 @@
         </w:tc>
         <w:tc>
           <w:tcPr>
-            <w:tcW w:type="dxa" w:w="4422"/>
+            <w:tcW w:type="dxa" w:w="3364"/>
           </w:tcPr>
           <w:p>
             <w:r>
@@ -397,9 +367,7 @@
           </w:tcPr>
           <w:p>
             <w:r>
-              <w:t>ПР</w:t>
-              <w:br/>
-              <w:t>Как полностью называется документ «ПР» из комплекта к договору? Если это прежнее название, укажите, какой документ используется сейчас.</w:t>
+              <w:t>Кто отвечает за подготовку и прикрепление закрывающих документов к сделке: менеджер или ассистент отдела продаж? Если обязанности разделены, укажите, что делает каждый. При нашей доставке отдельно укажите, кто принимает подписанные документы от водителя и передаёт их ассистенту для контроля возврата.</w:t>
             </w:r>
           </w:p>
         </w:tc>
@@ -408,11 +376,7 @@
             <w:tcW w:type="dxa" w:w="4422"/>
           </w:tcPr>
           <w:p>
-            <w:r>
-              <w:br/>
-              <w:br/>
-              <w:br/>
-            </w:r>
+            <w:r/>
           </w:p>
         </w:tc>
       </w:tr>
@@ -436,9 +400,7 @@
           </w:tcPr>
           <w:p>
             <w:r>
-              <w:t>ПСР</w:t>
-              <w:br/>
-              <w:t>Как полностью называется документ «ПСР» из комплекта к договору? Если это прежнее название, укажите, какой документ используется сейчас.</w:t>
+              <w:t>Когда монтаж выполнен, кто подтверждает его завершение и передаёт сделку на закрытие? Укажите должность, какие документы и фотографии этот сотрудник проверяет и какое его действие означает, что монтаж принят. Контроль возврата оригиналов ассистентом отдела продаж повторно описывать не нужно.</w:t>
             </w:r>
           </w:p>
         </w:tc>
@@ -447,67 +409,7 @@
             <w:tcW w:type="dxa" w:w="4422"/>
           </w:tcPr>
           <w:p>
-            <w:r>
-              <w:br/>
-              <w:br/>
-              <w:br/>
-            </w:r>
-          </w:p>
-        </w:tc>
-      </w:tr>
-    </w:tbl>
-    <w:p>
-      <w:pPr>
-        <w:pStyle w:val="Heading1"/>
-      </w:pPr>
-      <w:r>
-        <w:t>Структура карточек</w:t>
-      </w:r>
-    </w:p>
-    <w:tbl>
-      <w:tblPr>
-        <w:tblStyle w:val="TableGrid"/>
-        <w:tblW w:type="auto" w:w="0"/>
-        <w:tblLayout w:type="fixed"/>
-        <w:tblLook w:firstColumn="1" w:firstRow="1" w:lastColumn="0" w:lastRow="0" w:noHBand="0" w:noVBand="1" w:val="04A0"/>
-      </w:tblPr>
-      <w:tblGrid>
-        <w:gridCol w:w="3364"/>
-        <w:gridCol w:w="3364"/>
-        <w:gridCol w:w="3364"/>
-      </w:tblGrid>
-      <w:tr>
-        <w:trPr>
-          <w:tblHeader/>
-        </w:trPr>
-        <w:tc>
-          <w:tcPr>
-            <w:tcW w:type="dxa" w:w="454"/>
-          </w:tcPr>
-          <w:p>
-            <w:r>
-              <w:t>№</w:t>
-            </w:r>
-          </w:p>
-        </w:tc>
-        <w:tc>
-          <w:tcPr>
-            <w:tcW w:type="dxa" w:w="5216"/>
-          </w:tcPr>
-          <w:p>
-            <w:r>
-              <w:t>Вопрос</w:t>
-            </w:r>
-          </w:p>
-        </w:tc>
-        <w:tc>
-          <w:tcPr>
-            <w:tcW w:type="dxa" w:w="4422"/>
-          </w:tcPr>
-          <w:p>
-            <w:r>
-              <w:t>Ответ клиента</w:t>
-            </w:r>
+            <w:r/>
           </w:p>
         </w:tc>
       </w:tr>
@@ -531,9 +433,7 @@
           </w:tcPr>
           <w:p>
             <w:r>
-              <w:t>Обещанная структура карточек</w:t>
-              <w:br/>
-              <w:t>Укажите документ со структурой карточек лида и клиента, о котором договорились на встрече. Если он уже передан, повторно отправлять его не нужно. Если ещё не передан, приложите его.</w:t>
+              <w:t>ПРКак полностью называется документ «ПР» из комплекта к договору? Если это прежнее название, укажите, какой документ используется сейчас.</w:t>
             </w:r>
           </w:p>
         </w:tc>
@@ -542,42 +442,174 @@
             <w:tcW w:type="dxa" w:w="4422"/>
           </w:tcPr>
           <w:p>
+            <w:r/>
+          </w:p>
+        </w:tc>
+      </w:tr>
+      <w:tr>
+        <w:trPr>
+          <w:cantSplit/>
+        </w:trPr>
+        <w:tc>
+          <w:tcPr>
+            <w:tcW w:type="dxa" w:w="454"/>
+          </w:tcPr>
+          <w:p>
             <w:r>
-              <w:br/>
-              <w:br/>
-              <w:br/>
+              <w:t>9</w:t>
+            </w:r>
+          </w:p>
+        </w:tc>
+        <w:tc>
+          <w:tcPr>
+            <w:tcW w:type="dxa" w:w="5216"/>
+          </w:tcPr>
+          <w:p>
+            <w:r>
+              <w:t>ПСРКак полностью называется документ «ПСР» из комплекта к договору? Если это прежнее название, укажите, какой документ используется сейчас.</w:t>
+            </w:r>
+          </w:p>
+        </w:tc>
+        <w:tc>
+          <w:tcPr>
+            <w:tcW w:type="dxa" w:w="4422"/>
+          </w:tcPr>
+          <w:p>
+            <w:r/>
+          </w:p>
+        </w:tc>
+      </w:tr>
+    </w:tbl>
+    <w:p>
+      <w:pPr>
+        <w:pStyle w:val="Heading1"/>
+      </w:pPr>
+      <w:r>
+        <w:t>Структура карточек</w:t>
+      </w:r>
+    </w:p>
+    <w:tbl>
+      <w:tblPr>
+        <w:tblStyle w:val="TableGrid"/>
+        <w:tblW w:type="auto" w:w="0"/>
+        <w:tblLayout w:type="fixed"/>
+        <w:tblLook w:firstColumn="1" w:firstRow="1" w:lastColumn="0" w:lastRow="0" w:noHBand="0" w:noVBand="1" w:val="04A0"/>
+      </w:tblPr>
+      <w:tblGrid>
+        <w:gridCol w:w="454"/>
+        <w:gridCol w:w="5216"/>
+        <w:gridCol w:w="4422"/>
+      </w:tblGrid>
+      <w:tr>
+        <w:trPr>
+          <w:tblHeader/>
+        </w:trPr>
+        <w:tc>
+          <w:tcPr>
+            <w:tcW w:type="dxa" w:w="3364"/>
+          </w:tcPr>
+          <w:p>
+            <w:r>
+              <w:t>№</w:t>
+            </w:r>
+          </w:p>
+        </w:tc>
+        <w:tc>
+          <w:tcPr>
+            <w:tcW w:type="dxa" w:w="3364"/>
+          </w:tcPr>
+          <w:p>
+            <w:r>
+              <w:t>Вопрос</w:t>
+            </w:r>
+          </w:p>
+        </w:tc>
+        <w:tc>
+          <w:tcPr>
+            <w:tcW w:type="dxa" w:w="3364"/>
+          </w:tcPr>
+          <w:p>
+            <w:r>
+              <w:t>Ответ клиента</w:t>
             </w:r>
           </w:p>
         </w:tc>
       </w:tr>
+      <w:tr>
+        <w:trPr>
+          <w:cantSplit/>
+        </w:trPr>
+        <w:tc>
+          <w:tcPr>
+            <w:tcW w:type="dxa" w:w="454"/>
+          </w:tcPr>
+          <w:p>
+            <w:r>
+              <w:t>10</w:t>
+            </w:r>
+          </w:p>
+        </w:tc>
+        <w:tc>
+          <w:tcPr>
+            <w:tcW w:type="dxa" w:w="5216"/>
+          </w:tcPr>
+          <w:p>
+            <w:r>
+              <w:t>Обещанная структура карточекУкажите документ со структурой карточек лида и клиента, о котором договорились на встрече. Если он уже передан, повторно отправлять его не нужно. Если ещё не передан, приложите его.</w:t>
+            </w:r>
+          </w:p>
+        </w:tc>
+        <w:tc>
+          <w:tcPr>
+            <w:tcW w:type="dxa" w:w="4422"/>
+          </w:tcPr>
+          <w:p>
+            <w:r/>
+          </w:p>
+        </w:tc>
+      </w:tr>
     </w:tbl>
+    <w:p>
+      <w:pPr>
+        <w:pStyle w:val="Heading1"/>
+      </w:pPr>
+      <w:r>
+        <w:t>Подтверждение ответов</w:t>
+      </w:r>
+    </w:p>
+    <w:p>
+      <w:r>
+        <w:t>Подтверждаю, что прочитал(а) вопросы и заполненные ответы отражают согласованный порядок работы. Если ответ зависит от условия, это условие указано. Приложенные документы относятся к актуальному процессу. Эти ответы можно использовать для подготовки технического задания; окончательное техническое задание согласуется отдельно.</w:t>
+      </w:r>
+    </w:p>
+    <w:p>
+      <w:r>
+        <w:t>Должность согласующего: ____________________</w:t>
+      </w:r>
+    </w:p>
+    <w:p>
+      <w:r>
+        <w:t>Дата: ____________________</w:t>
+      </w:r>
+    </w:p>
+    <w:p>
+      <w:r>
+        <w:t>Подтверждение / подпись: ____________________</w:t>
+      </w:r>
+    </w:p>
+    <w:p>
+      <w:r>
+        <w:t>Если требуется исправить другой ранее описанный шаг процесса, укажите только это изменение: ____________________</w:t>
+      </w:r>
+    </w:p>
     <w:sectPr>
-      <w:footerReference w:type="default" r:id="rId9"/>
       <w:pgSz w:w="11906" w:h="16838"/>
-      <w:pgMar w:top="907" w:right="907" w:bottom="907" w:left="907" w:header="720" w:footer="397" w:gutter="0"/>
+      <w:pgMar w:top="907" w:right="907" w:bottom="907" w:left="907" w:header="720" w:footer="720" w:gutter="0"/>
       <w:cols w:space="720"/>
       <w:docGrid w:linePitch="360"/>
     </w:sectPr>
   </w:body>
 </w:document>
-</file>
-
-<file path=word/footer1.xml><?xml version="1.0" encoding="utf-8"?>
-<w:ftr xmlns:m="http://schemas.openxmlformats.org/officeDocument/2006/math" xmlns:mc="http://schemas.openxmlformats.org/markup-compatibility/2006" xmlns:mo="http://schemas.microsoft.com/office/mac/office/2008/main" xmlns:mv="urn:schemas-microsoft-com:mac:vml" xmlns:o="urn:schemas-microsoft-com:office:office" xmlns:r="http://schemas.openxmlformats.org/officeDocument/2006/relationships" xmlns:v="urn:schemas-microsoft-com:vml" xmlns:w10="urn:schemas-microsoft-com:office:word" xmlns:w14="http://schemas.microsoft.com/office/word/2010/wordml" xmlns:w="http://schemas.openxmlformats.org/wordprocessingml/2006/main" xmlns:wne="http://schemas.microsoft.com/office/word/2006/wordml" xmlns:wp14="http://schemas.microsoft.com/office/word/2010/wordprocessingDrawing" xmlns:wp="http://schemas.openxmlformats.org/drawingml/2006/wordprocessingDrawing" xmlns:wpc="http://schemas.microsoft.com/office/word/2010/wordprocessingCanvas" xmlns:wpg="http://schemas.microsoft.com/office/word/2010/wordprocessingGroup" xmlns:wpi="http://schemas.microsoft.com/office/word/2010/wordprocessingInk" xmlns:wps="http://schemas.microsoft.com/office/word/2010/wordprocessingShape" mc:Ignorable="w14 wp14">
-  <w:p>
-    <w:pPr>
-      <w:pStyle w:val="Footer"/>
-      <w:jc w:val="right"/>
-    </w:pPr>
-    <w:r>
-      <w:rPr>
-        <w:sz w:val="18"/>
-      </w:rPr>
-      <w:t xml:space="preserve">Страница </w:t>
-    </w:r>
-    <w:fldSimple w:instr="PAGE"/>
-  </w:p>
-</w:ftr>
 </file>
 
 <file path=word/numbering.xml><?xml version="1.0" encoding="utf-8"?>
@@ -943,9 +975,6 @@
     <w:name w:val="Normal"/>
     <w:qFormat/>
     <w:rsid w:val="00FC693F"/>
-    <w:pPr>
-      <w:spacing w:after="80" w:line="252" w:lineRule="auto"/>
-    </w:pPr>
     <w:rPr>
       <w:rFonts w:ascii="Arial" w:hAnsi="Arial"/>
       <w:sz w:val="22"/>
@@ -1006,15 +1035,15 @@
     <w:pPr>
       <w:keepNext/>
       <w:keepLines/>
-      <w:spacing w:before="480" w:after="120"/>
+      <w:spacing w:before="480" w:after="0"/>
       <w:outlineLvl w:val="0"/>
     </w:pPr>
     <w:rPr>
-      <w:rFonts w:asciiTheme="majorHAnsi" w:eastAsiaTheme="majorEastAsia" w:hAnsiTheme="majorHAnsi" w:cstheme="majorBidi" w:ascii="Arial" w:hAnsi="Arial"/>
+      <w:rFonts w:asciiTheme="majorHAnsi" w:eastAsiaTheme="majorEastAsia" w:hAnsiTheme="majorHAnsi" w:cstheme="majorBidi"/>
       <w:b/>
       <w:bCs/>
-      <w:color w:val="000000"/>
-      <w:sz w:val="26"/>
+      <w:color w:val="365F91" w:themeColor="accent1" w:themeShade="BF"/>
+      <w:sz w:val="28"/>
       <w:szCs w:val="28"/>
     </w:rPr>
   </w:style>
@@ -1292,19 +1321,18 @@
     <w:qFormat/>
     <w:rsid w:val="00FC693F"/>
     <w:pPr>
-      <w:keepNext/>
       <w:pBdr>
         <w:bottom w:val="single" w:sz="8" w:space="4" w:color="4F81BD" w:themeColor="accent1"/>
       </w:pBdr>
-      <w:spacing w:after="120" w:line="240" w:lineRule="auto"/>
+      <w:spacing w:after="300" w:line="240" w:lineRule="auto"/>
       <w:contextualSpacing/>
     </w:pPr>
     <w:rPr>
-      <w:rFonts w:asciiTheme="majorHAnsi" w:eastAsiaTheme="majorEastAsia" w:hAnsiTheme="majorHAnsi" w:cstheme="majorBidi" w:ascii="Arial" w:hAnsi="Arial"/>
-      <w:color w:val="000000"/>
+      <w:rFonts w:asciiTheme="majorHAnsi" w:eastAsiaTheme="majorEastAsia" w:hAnsiTheme="majorHAnsi" w:cstheme="majorBidi"/>
+      <w:color w:val="17365D" w:themeColor="text2" w:themeShade="BF"/>
       <w:spacing w:val="5"/>
       <w:kern w:val="28"/>
-      <w:sz w:val="36"/>
+      <w:sz w:val="52"/>
       <w:szCs w:val="52"/>
     </w:rPr>
   </w:style>

</xml_diff>

<commit_message>
docs: complete bounded client clarification coverage
Replace the incomplete ten-question form with eighteen source-linked
clarifications and connect unresolved montage decisions from the process map.
Record local SQLite evidence coverage and per-question retrieval limits.
Keep source originals, application scripts and CRM unchanged.

ТЗ: docs/tz/TZ-DOCS-DELIVERY.md#U
Atom: eurosteklo-a58
</commit_message>
<xml_diff>
--- a/docs/review/2026-10-05-consistency/Евростекло-уточнение-процесса.docx
+++ b/docs/review/2026-10-05-consistency/Евростекло-уточнение-процесса.docx
@@ -12,7 +12,7 @@
     </w:p>
     <w:p>
       <w:r>
-        <w:t>Пожалуйста, заполните только колонку «Ответ клиента». В вопросах уточняются оставшиеся решения и неоднозначные места; уже полученные ответы повторно не запрашиваются. Укажите конкретное правило, должность, срок или документ — в зависимости от вопроса. Если пункт не применяется, напишите это. Если решение пока не принято, укажите, кто его согласует.</w:t>
+        <w:t>Заполните только колонку «Ответ клиента». Укажите конкретное правило, должность, срок или документ. Если решение зависит от условия, укажите это условие. Если пункт не применяется, напишите это. Если решение пока не принято, укажите, кто и к какой дате его согласует. Уже полученные однозначные ответы повторно не запрашиваются.</w:t>
       </w:r>
     </w:p>
     <w:p>
@@ -32,8 +32,8 @@
       </w:tblPr>
       <w:tblGrid>
         <w:gridCol w:w="454"/>
-        <w:gridCol w:w="5216"/>
-        <w:gridCol w:w="4422"/>
+        <w:gridCol w:w="5783"/>
+        <w:gridCol w:w="3969"/>
       </w:tblGrid>
       <w:tr>
         <w:trPr>
@@ -41,7 +41,7 @@
         </w:trPr>
         <w:tc>
           <w:tcPr>
-            <w:tcW w:type="dxa" w:w="3364"/>
+            <w:tcW w:type="dxa" w:w="454"/>
           </w:tcPr>
           <w:p>
             <w:r>
@@ -51,7 +51,7 @@
         </w:tc>
         <w:tc>
           <w:tcPr>
-            <w:tcW w:type="dxa" w:w="3364"/>
+            <w:tcW w:type="dxa" w:w="5783"/>
           </w:tcPr>
           <w:p>
             <w:r>
@@ -61,7 +61,7 @@
         </w:tc>
         <w:tc>
           <w:tcPr>
-            <w:tcW w:type="dxa" w:w="3364"/>
+            <w:tcW w:type="dxa" w:w="3969"/>
           </w:tcPr>
           <w:p>
             <w:r>
@@ -86,7 +86,7 @@
         </w:tc>
         <w:tc>
           <w:tcPr>
-            <w:tcW w:type="dxa" w:w="5216"/>
+            <w:tcW w:type="dxa" w:w="5783"/>
           </w:tcPr>
           <w:p>
             <w:r>
@@ -96,11 +96,13 @@
         </w:tc>
         <w:tc>
           <w:tcPr>
-            <w:tcW w:type="dxa" w:w="4422"/>
+            <w:tcW w:type="dxa" w:w="3969"/>
           </w:tcPr>
           <w:p>
             <w:r/>
           </w:p>
+          <w:p/>
+          <w:p/>
         </w:tc>
       </w:tr>
       <w:tr>
@@ -119,7 +121,7 @@
         </w:tc>
         <w:tc>
           <w:tcPr>
-            <w:tcW w:type="dxa" w:w="5216"/>
+            <w:tcW w:type="dxa" w:w="5783"/>
           </w:tcPr>
           <w:p>
             <w:r>
@@ -129,11 +131,13 @@
         </w:tc>
         <w:tc>
           <w:tcPr>
-            <w:tcW w:type="dxa" w:w="4422"/>
+            <w:tcW w:type="dxa" w:w="3969"/>
           </w:tcPr>
           <w:p>
             <w:r/>
           </w:p>
+          <w:p/>
+          <w:p/>
         </w:tc>
       </w:tr>
       <w:tr>
@@ -152,7 +156,7 @@
         </w:tc>
         <w:tc>
           <w:tcPr>
-            <w:tcW w:type="dxa" w:w="5216"/>
+            <w:tcW w:type="dxa" w:w="5783"/>
           </w:tcPr>
           <w:p>
             <w:r>
@@ -162,11 +166,48 @@
         </w:tc>
         <w:tc>
           <w:tcPr>
-            <w:tcW w:type="dxa" w:w="4422"/>
+            <w:tcW w:type="dxa" w:w="3969"/>
           </w:tcPr>
           <w:p>
             <w:r/>
           </w:p>
+          <w:p/>
+          <w:p/>
+        </w:tc>
+      </w:tr>
+      <w:tr>
+        <w:trPr>
+          <w:cantSplit/>
+        </w:trPr>
+        <w:tc>
+          <w:tcPr>
+            <w:tcW w:type="dxa" w:w="454"/>
+          </w:tcPr>
+          <w:p>
+            <w:r>
+              <w:t>4</w:t>
+            </w:r>
+          </w:p>
+        </w:tc>
+        <w:tc>
+          <w:tcPr>
+            <w:tcW w:type="dxa" w:w="5783"/>
+          </w:tcPr>
+          <w:p>
+            <w:r>
+              <w:t>Повторный дозвон. Если ассистент отдела продаж не дозвонился до клиента для обратной связи, сколько повторных попыток он делает, с каким интервалом и когда прекращает попытки? Если интервал указан в днях, уточните: рабочих или календарных.</w:t>
+            </w:r>
+          </w:p>
+        </w:tc>
+        <w:tc>
+          <w:tcPr>
+            <w:tcW w:type="dxa" w:w="3969"/>
+          </w:tcPr>
+          <w:p>
+            <w:r/>
+          </w:p>
+          <w:p/>
+          <w:p/>
         </w:tc>
       </w:tr>
     </w:tbl>
@@ -187,8 +228,8 @@
       </w:tblPr>
       <w:tblGrid>
         <w:gridCol w:w="454"/>
-        <w:gridCol w:w="5216"/>
-        <w:gridCol w:w="4422"/>
+        <w:gridCol w:w="5783"/>
+        <w:gridCol w:w="3969"/>
       </w:tblGrid>
       <w:tr>
         <w:trPr>
@@ -196,7 +237,7 @@
         </w:trPr>
         <w:tc>
           <w:tcPr>
-            <w:tcW w:type="dxa" w:w="3364"/>
+            <w:tcW w:type="dxa" w:w="454"/>
           </w:tcPr>
           <w:p>
             <w:r>
@@ -206,7 +247,7 @@
         </w:tc>
         <w:tc>
           <w:tcPr>
-            <w:tcW w:type="dxa" w:w="3364"/>
+            <w:tcW w:type="dxa" w:w="5783"/>
           </w:tcPr>
           <w:p>
             <w:r>
@@ -216,45 +257,12 @@
         </w:tc>
         <w:tc>
           <w:tcPr>
-            <w:tcW w:type="dxa" w:w="3364"/>
+            <w:tcW w:type="dxa" w:w="3969"/>
           </w:tcPr>
           <w:p>
             <w:r>
               <w:t>Ответ клиента</w:t>
             </w:r>
-          </w:p>
-        </w:tc>
-      </w:tr>
-      <w:tr>
-        <w:trPr>
-          <w:cantSplit/>
-        </w:trPr>
-        <w:tc>
-          <w:tcPr>
-            <w:tcW w:type="dxa" w:w="454"/>
-          </w:tcPr>
-          <w:p>
-            <w:r>
-              <w:t>4</w:t>
-            </w:r>
-          </w:p>
-        </w:tc>
-        <w:tc>
-          <w:tcPr>
-            <w:tcW w:type="dxa" w:w="5216"/>
-          </w:tcPr>
-          <w:p>
-            <w:r>
-              <w:t>Стоимость замера в заказеОплата замера уменьшает сумму к оплате за последующий заказ или замер оплачивается отдельно от заказа?</w:t>
-            </w:r>
-          </w:p>
-        </w:tc>
-        <w:tc>
-          <w:tcPr>
-            <w:tcW w:type="dxa" w:w="4422"/>
-          </w:tcPr>
-          <w:p>
-            <w:r/>
           </w:p>
         </w:tc>
       </w:tr>
@@ -274,77 +282,23 @@
         </w:tc>
         <w:tc>
           <w:tcPr>
-            <w:tcW w:type="dxa" w:w="5216"/>
+            <w:tcW w:type="dxa" w:w="5783"/>
           </w:tcPr>
           <w:p>
             <w:r>
-              <w:t>Понижающий коэффициентЧто меняет понижающий коэффициент в расчёте заказа и в каких случаях его применяют? Если сейчас его не используют, напишите «Не применяется».</w:t>
+              <w:t>Стоимость замера в заказеОплата замера уменьшает сумму к оплате за последующий заказ или замер оплачивается отдельно от заказа?</w:t>
             </w:r>
           </w:p>
         </w:tc>
         <w:tc>
           <w:tcPr>
-            <w:tcW w:type="dxa" w:w="4422"/>
+            <w:tcW w:type="dxa" w:w="3969"/>
           </w:tcPr>
           <w:p>
             <w:r/>
           </w:p>
-        </w:tc>
-      </w:tr>
-    </w:tbl>
-    <w:p>
-      <w:pPr>
-        <w:pStyle w:val="Heading1"/>
-      </w:pPr>
-      <w:r>
-        <w:t>Документы и завершение работ</w:t>
-      </w:r>
-    </w:p>
-    <w:tbl>
-      <w:tblPr>
-        <w:tblStyle w:val="TableGrid"/>
-        <w:tblW w:type="auto" w:w="0"/>
-        <w:tblLayout w:type="fixed"/>
-        <w:tblLook w:firstColumn="1" w:firstRow="1" w:lastColumn="0" w:lastRow="0" w:noHBand="0" w:noVBand="1" w:val="04A0"/>
-      </w:tblPr>
-      <w:tblGrid>
-        <w:gridCol w:w="454"/>
-        <w:gridCol w:w="5216"/>
-        <w:gridCol w:w="4422"/>
-      </w:tblGrid>
-      <w:tr>
-        <w:trPr>
-          <w:tblHeader/>
-        </w:trPr>
-        <w:tc>
-          <w:tcPr>
-            <w:tcW w:type="dxa" w:w="3364"/>
-          </w:tcPr>
-          <w:p>
-            <w:r>
-              <w:t>№</w:t>
-            </w:r>
-          </w:p>
-        </w:tc>
-        <w:tc>
-          <w:tcPr>
-            <w:tcW w:type="dxa" w:w="3364"/>
-          </w:tcPr>
-          <w:p>
-            <w:r>
-              <w:t>Вопрос</w:t>
-            </w:r>
-          </w:p>
-        </w:tc>
-        <w:tc>
-          <w:tcPr>
-            <w:tcW w:type="dxa" w:w="3364"/>
-          </w:tcPr>
-          <w:p>
-            <w:r>
-              <w:t>Ответ клиента</w:t>
-            </w:r>
-          </w:p>
+          <w:p/>
+          <w:p/>
         </w:tc>
       </w:tr>
       <w:tr>
@@ -363,20 +317,78 @@
         </w:tc>
         <w:tc>
           <w:tcPr>
-            <w:tcW w:type="dxa" w:w="5216"/>
+            <w:tcW w:type="dxa" w:w="5783"/>
           </w:tcPr>
           <w:p>
             <w:r>
-              <w:t>Кто отвечает за подготовку и прикрепление закрывающих документов к сделке: менеджер или ассистент отдела продаж? Если обязанности разделены, укажите, что делает каждый. При нашей доставке отдельно укажите, кто принимает подписанные документы от водителя и передаёт их ассистенту для контроля возврата.</w:t>
+              <w:t>Понижающий коэффициентЧто меняет понижающий коэффициент в расчёте заказа и в каких случаях его применяют? Если сейчас его не используют, напишите «Не применяется».</w:t>
             </w:r>
           </w:p>
         </w:tc>
         <w:tc>
           <w:tcPr>
-            <w:tcW w:type="dxa" w:w="4422"/>
+            <w:tcW w:type="dxa" w:w="3969"/>
           </w:tcPr>
           <w:p>
             <w:r/>
+          </w:p>
+          <w:p/>
+          <w:p/>
+        </w:tc>
+      </w:tr>
+    </w:tbl>
+    <w:p>
+      <w:pPr>
+        <w:pStyle w:val="Heading1"/>
+      </w:pPr>
+      <w:r>
+        <w:t>Проверка договора</w:t>
+      </w:r>
+    </w:p>
+    <w:tbl>
+      <w:tblPr>
+        <w:tblStyle w:val="TableGrid"/>
+        <w:tblW w:type="auto" w:w="0"/>
+        <w:tblLayout w:type="fixed"/>
+        <w:tblLook w:firstColumn="1" w:firstRow="1" w:lastColumn="0" w:lastRow="0" w:noHBand="0" w:noVBand="1" w:val="04A0"/>
+      </w:tblPr>
+      <w:tblGrid>
+        <w:gridCol w:w="454"/>
+        <w:gridCol w:w="5783"/>
+        <w:gridCol w:w="3969"/>
+      </w:tblGrid>
+      <w:tr>
+        <w:trPr>
+          <w:tblHeader/>
+        </w:trPr>
+        <w:tc>
+          <w:tcPr>
+            <w:tcW w:type="dxa" w:w="454"/>
+          </w:tcPr>
+          <w:p>
+            <w:r>
+              <w:t>№</w:t>
+            </w:r>
+          </w:p>
+        </w:tc>
+        <w:tc>
+          <w:tcPr>
+            <w:tcW w:type="dxa" w:w="5783"/>
+          </w:tcPr>
+          <w:p>
+            <w:r>
+              <w:t>Вопрос</w:t>
+            </w:r>
+          </w:p>
+        </w:tc>
+        <w:tc>
+          <w:tcPr>
+            <w:tcW w:type="dxa" w:w="3969"/>
+          </w:tcPr>
+          <w:p>
+            <w:r>
+              <w:t>Ответ клиента</w:t>
+            </w:r>
           </w:p>
         </w:tc>
       </w:tr>
@@ -396,20 +408,78 @@
         </w:tc>
         <w:tc>
           <w:tcPr>
-            <w:tcW w:type="dxa" w:w="5216"/>
+            <w:tcW w:type="dxa" w:w="5783"/>
           </w:tcPr>
           <w:p>
             <w:r>
-              <w:t>Когда монтаж выполнен, кто подтверждает его завершение и передаёт сделку на закрытие? Укажите должность, какие документы и фотографии этот сотрудник проверяет и какое его действие означает, что монтаж принят. Контроль возврата оригиналов ассистентом отдела продаж повторно описывать не нужно.</w:t>
+              <w:t>Юрист не ответил в срок. Для проверки договора обсуждались три рабочих дня. Кто и что делает, если этот срок истёк, а ответа нет? Как после этого продолжается работа со сделкой? Укажите также событие, от которого отсчитываются эти три рабочих дня.</w:t>
             </w:r>
           </w:p>
         </w:tc>
         <w:tc>
           <w:tcPr>
-            <w:tcW w:type="dxa" w:w="4422"/>
+            <w:tcW w:type="dxa" w:w="3969"/>
           </w:tcPr>
           <w:p>
             <w:r/>
+          </w:p>
+          <w:p/>
+          <w:p/>
+        </w:tc>
+      </w:tr>
+    </w:tbl>
+    <w:p>
+      <w:pPr>
+        <w:pStyle w:val="Heading1"/>
+      </w:pPr>
+      <w:r>
+        <w:t>Документы</w:t>
+      </w:r>
+    </w:p>
+    <w:tbl>
+      <w:tblPr>
+        <w:tblStyle w:val="TableGrid"/>
+        <w:tblW w:type="auto" w:w="0"/>
+        <w:tblLayout w:type="fixed"/>
+        <w:tblLook w:firstColumn="1" w:firstRow="1" w:lastColumn="0" w:lastRow="0" w:noHBand="0" w:noVBand="1" w:val="04A0"/>
+      </w:tblPr>
+      <w:tblGrid>
+        <w:gridCol w:w="454"/>
+        <w:gridCol w:w="5783"/>
+        <w:gridCol w:w="3969"/>
+      </w:tblGrid>
+      <w:tr>
+        <w:trPr>
+          <w:tblHeader/>
+        </w:trPr>
+        <w:tc>
+          <w:tcPr>
+            <w:tcW w:type="dxa" w:w="454"/>
+          </w:tcPr>
+          <w:p>
+            <w:r>
+              <w:t>№</w:t>
+            </w:r>
+          </w:p>
+        </w:tc>
+        <w:tc>
+          <w:tcPr>
+            <w:tcW w:type="dxa" w:w="5783"/>
+          </w:tcPr>
+          <w:p>
+            <w:r>
+              <w:t>Вопрос</w:t>
+            </w:r>
+          </w:p>
+        </w:tc>
+        <w:tc>
+          <w:tcPr>
+            <w:tcW w:type="dxa" w:w="3969"/>
+          </w:tcPr>
+          <w:p>
+            <w:r>
+              <w:t>Ответ клиента</w:t>
+            </w:r>
           </w:p>
         </w:tc>
       </w:tr>
@@ -429,21 +499,23 @@
         </w:tc>
         <w:tc>
           <w:tcPr>
-            <w:tcW w:type="dxa" w:w="5216"/>
+            <w:tcW w:type="dxa" w:w="5783"/>
           </w:tcPr>
           <w:p>
             <w:r>
-              <w:t>ПРКак полностью называется документ «ПР» из комплекта к договору? Если это прежнее название, укажите, какой документ используется сейчас.</w:t>
+              <w:t>Кто отвечает за подготовку и прикрепление закрывающих документов к сделке: менеджер или ассистент отдела продаж? Если обязанности разделены, укажите, что делает каждый. При нашей доставке отдельно укажите, кто принимает подписанные документы от водителя и передаёт их ассистенту для контроля возврата.</w:t>
             </w:r>
           </w:p>
         </w:tc>
         <w:tc>
           <w:tcPr>
-            <w:tcW w:type="dxa" w:w="4422"/>
+            <w:tcW w:type="dxa" w:w="3969"/>
           </w:tcPr>
           <w:p>
             <w:r/>
           </w:p>
+          <w:p/>
+          <w:p/>
         </w:tc>
       </w:tr>
       <w:tr>
@@ -462,7 +534,42 @@
         </w:tc>
         <w:tc>
           <w:tcPr>
-            <w:tcW w:type="dxa" w:w="5216"/>
+            <w:tcW w:type="dxa" w:w="5783"/>
+          </w:tcPr>
+          <w:p>
+            <w:r>
+              <w:t>ПРКак полностью называется документ «ПР» из комплекта к договору? Если это прежнее название, укажите, какой документ используется сейчас.</w:t>
+            </w:r>
+          </w:p>
+        </w:tc>
+        <w:tc>
+          <w:tcPr>
+            <w:tcW w:type="dxa" w:w="3969"/>
+          </w:tcPr>
+          <w:p>
+            <w:r/>
+          </w:p>
+          <w:p/>
+          <w:p/>
+        </w:tc>
+      </w:tr>
+      <w:tr>
+        <w:trPr>
+          <w:cantSplit/>
+        </w:trPr>
+        <w:tc>
+          <w:tcPr>
+            <w:tcW w:type="dxa" w:w="454"/>
+          </w:tcPr>
+          <w:p>
+            <w:r>
+              <w:t>10</w:t>
+            </w:r>
+          </w:p>
+        </w:tc>
+        <w:tc>
+          <w:tcPr>
+            <w:tcW w:type="dxa" w:w="5783"/>
           </w:tcPr>
           <w:p>
             <w:r>
@@ -472,11 +579,13 @@
         </w:tc>
         <w:tc>
           <w:tcPr>
-            <w:tcW w:type="dxa" w:w="4422"/>
+            <w:tcW w:type="dxa" w:w="3969"/>
           </w:tcPr>
           <w:p>
             <w:r/>
           </w:p>
+          <w:p/>
+          <w:p/>
         </w:tc>
       </w:tr>
     </w:tbl>
@@ -485,7 +594,7 @@
         <w:pStyle w:val="Heading1"/>
       </w:pPr>
       <w:r>
-        <w:t>Структура карточек</w:t>
+        <w:t>Монтаж и приёмка</w:t>
       </w:r>
     </w:p>
     <w:tbl>
@@ -497,8 +606,8 @@
       </w:tblPr>
       <w:tblGrid>
         <w:gridCol w:w="454"/>
-        <w:gridCol w:w="5216"/>
-        <w:gridCol w:w="4422"/>
+        <w:gridCol w:w="5783"/>
+        <w:gridCol w:w="3969"/>
       </w:tblGrid>
       <w:tr>
         <w:trPr>
@@ -506,7 +615,7 @@
         </w:trPr>
         <w:tc>
           <w:tcPr>
-            <w:tcW w:type="dxa" w:w="3364"/>
+            <w:tcW w:type="dxa" w:w="454"/>
           </w:tcPr>
           <w:p>
             <w:r>
@@ -516,7 +625,7 @@
         </w:tc>
         <w:tc>
           <w:tcPr>
-            <w:tcW w:type="dxa" w:w="3364"/>
+            <w:tcW w:type="dxa" w:w="5783"/>
           </w:tcPr>
           <w:p>
             <w:r>
@@ -526,7 +635,7 @@
         </w:tc>
         <w:tc>
           <w:tcPr>
-            <w:tcW w:type="dxa" w:w="3364"/>
+            <w:tcW w:type="dxa" w:w="3969"/>
           </w:tcPr>
           <w:p>
             <w:r>
@@ -545,13 +654,314 @@
           </w:tcPr>
           <w:p>
             <w:r>
-              <w:t>10</w:t>
+              <w:t>11</w:t>
             </w:r>
           </w:p>
         </w:tc>
         <w:tc>
           <w:tcPr>
-            <w:tcW w:type="dxa" w:w="5216"/>
+            <w:tcW w:type="dxa" w:w="5783"/>
+          </w:tcPr>
+          <w:p>
+            <w:r>
+              <w:t>Когда монтаж выполнен, кто подтверждает его завершение и передаёт сделку на закрытие? Укажите должность, какие документы и фотографии этот сотрудник проверяет и какое его действие означает, что монтаж принят. Контроль возврата оригиналов ассистентом отдела продаж повторно описывать не нужно.</w:t>
+            </w:r>
+          </w:p>
+        </w:tc>
+        <w:tc>
+          <w:tcPr>
+            <w:tcW w:type="dxa" w:w="3969"/>
+          </w:tcPr>
+          <w:p>
+            <w:r/>
+          </w:p>
+          <w:p/>
+          <w:p/>
+        </w:tc>
+      </w:tr>
+      <w:tr>
+        <w:trPr>
+          <w:cantSplit/>
+        </w:trPr>
+        <w:tc>
+          <w:tcPr>
+            <w:tcW w:type="dxa" w:w="454"/>
+          </w:tcPr>
+          <w:p>
+            <w:r>
+              <w:t>12</w:t>
+            </w:r>
+          </w:p>
+        </w:tc>
+        <w:tc>
+          <w:tcPr>
+            <w:tcW w:type="dxa" w:w="5783"/>
+          </w:tcPr>
+          <w:p>
+            <w:r>
+              <w:t>Объект не готов к монтажу. Если к согласованной дате проёмы или помещение не готовы, кто решает, проводить ли монтаж, кто согласует готовность с клиентом и в каком состоянии остаётся заказ? Укажите название стадии сделки.</w:t>
+            </w:r>
+          </w:p>
+        </w:tc>
+        <w:tc>
+          <w:tcPr>
+            <w:tcW w:type="dxa" w:w="3969"/>
+          </w:tcPr>
+          <w:p>
+            <w:r/>
+          </w:p>
+          <w:p/>
+          <w:p/>
+        </w:tc>
+      </w:tr>
+      <w:tr>
+        <w:trPr>
+          <w:cantSplit/>
+        </w:trPr>
+        <w:tc>
+          <w:tcPr>
+            <w:tcW w:type="dxa" w:w="454"/>
+          </w:tcPr>
+          <w:p>
+            <w:r>
+              <w:t>13</w:t>
+            </w:r>
+          </w:p>
+        </w:tc>
+        <w:tc>
+          <w:tcPr>
+            <w:tcW w:type="dxa" w:w="5783"/>
+          </w:tcPr>
+          <w:p>
+            <w:r>
+              <w:t>Клиент не принимает монтаж. Если работы выполнены, но клиент отказывается подписать приёмку, кто разбирает причину, как оформляется результат и при каком условии работа считается принятой?</w:t>
+            </w:r>
+          </w:p>
+        </w:tc>
+        <w:tc>
+          <w:tcPr>
+            <w:tcW w:type="dxa" w:w="3969"/>
+          </w:tcPr>
+          <w:p>
+            <w:r/>
+          </w:p>
+          <w:p/>
+          <w:p/>
+        </w:tc>
+      </w:tr>
+      <w:tr>
+        <w:trPr>
+          <w:cantSplit/>
+        </w:trPr>
+        <w:tc>
+          <w:tcPr>
+            <w:tcW w:type="dxa" w:w="454"/>
+          </w:tcPr>
+          <w:p>
+            <w:r>
+              <w:t>14</w:t>
+            </w:r>
+          </w:p>
+        </w:tc>
+        <w:tc>
+          <w:tcPr>
+            <w:tcW w:type="dxa" w:w="5783"/>
+          </w:tcPr>
+          <w:p>
+            <w:r>
+              <w:t>Переделка до приёмки. Если до подписания приёмки требуется исправить выполненный монтаж, кто организует исправление и кто подтверждает его результат? Остаётся ли исходная сделка открытой до этого подтверждения? Позднейшие рекламации здесь не уточняются.</w:t>
+            </w:r>
+          </w:p>
+        </w:tc>
+        <w:tc>
+          <w:tcPr>
+            <w:tcW w:type="dxa" w:w="3969"/>
+          </w:tcPr>
+          <w:p>
+            <w:r/>
+          </w:p>
+          <w:p/>
+          <w:p/>
+        </w:tc>
+      </w:tr>
+      <w:tr>
+        <w:trPr>
+          <w:cantSplit/>
+        </w:trPr>
+        <w:tc>
+          <w:tcPr>
+            <w:tcW w:type="dxa" w:w="454"/>
+          </w:tcPr>
+          <w:p>
+            <w:r>
+              <w:t>15</w:t>
+            </w:r>
+          </w:p>
+        </w:tc>
+        <w:tc>
+          <w:tcPr>
+            <w:tcW w:type="dxa" w:w="5783"/>
+          </w:tcPr>
+          <w:p>
+            <w:r>
+              <w:t>Перенос даты монтажа. Если клиент переносит согласованную дату, кто фиксирует новую дату, сообщает её бригаде и меняет состояние заказа, если такое изменение требуется?</w:t>
+            </w:r>
+          </w:p>
+        </w:tc>
+        <w:tc>
+          <w:tcPr>
+            <w:tcW w:type="dxa" w:w="3969"/>
+          </w:tcPr>
+          <w:p>
+            <w:r/>
+          </w:p>
+          <w:p/>
+          <w:p/>
+        </w:tc>
+      </w:tr>
+      <w:tr>
+        <w:trPr>
+          <w:cantSplit/>
+        </w:trPr>
+        <w:tc>
+          <w:tcPr>
+            <w:tcW w:type="dxa" w:w="454"/>
+          </w:tcPr>
+          <w:p>
+            <w:r>
+              <w:t>16</w:t>
+            </w:r>
+          </w:p>
+        </w:tc>
+        <w:tc>
+          <w:tcPr>
+            <w:tcW w:type="dxa" w:w="5783"/>
+          </w:tcPr>
+          <w:p>
+            <w:r>
+              <w:t>Оплата монтажа. Какую часть стоимости монтажа клиент оплачивает до начала работ, а какую — после приёмки? Если всегда действует один порядок, укажите его; если порядок зависит от договора, укажите условие.</w:t>
+            </w:r>
+          </w:p>
+        </w:tc>
+        <w:tc>
+          <w:tcPr>
+            <w:tcW w:type="dxa" w:w="3969"/>
+          </w:tcPr>
+          <w:p>
+            <w:r/>
+          </w:p>
+          <w:p/>
+          <w:p/>
+        </w:tc>
+      </w:tr>
+    </w:tbl>
+    <w:p>
+      <w:pPr>
+        <w:pStyle w:val="Heading1"/>
+      </w:pPr>
+      <w:r>
+        <w:t>Уведомления и структура карточек</w:t>
+      </w:r>
+    </w:p>
+    <w:tbl>
+      <w:tblPr>
+        <w:tblStyle w:val="TableGrid"/>
+        <w:tblW w:type="auto" w:w="0"/>
+        <w:tblLayout w:type="fixed"/>
+        <w:tblLook w:firstColumn="1" w:firstRow="1" w:lastColumn="0" w:lastRow="0" w:noHBand="0" w:noVBand="1" w:val="04A0"/>
+      </w:tblPr>
+      <w:tblGrid>
+        <w:gridCol w:w="454"/>
+        <w:gridCol w:w="5783"/>
+        <w:gridCol w:w="3969"/>
+      </w:tblGrid>
+      <w:tr>
+        <w:trPr>
+          <w:tblHeader/>
+        </w:trPr>
+        <w:tc>
+          <w:tcPr>
+            <w:tcW w:type="dxa" w:w="454"/>
+          </w:tcPr>
+          <w:p>
+            <w:r>
+              <w:t>№</w:t>
+            </w:r>
+          </w:p>
+        </w:tc>
+        <w:tc>
+          <w:tcPr>
+            <w:tcW w:type="dxa" w:w="5783"/>
+          </w:tcPr>
+          <w:p>
+            <w:r>
+              <w:t>Вопрос</w:t>
+            </w:r>
+          </w:p>
+        </w:tc>
+        <w:tc>
+          <w:tcPr>
+            <w:tcW w:type="dxa" w:w="3969"/>
+          </w:tcPr>
+          <w:p>
+            <w:r>
+              <w:t>Ответ клиента</w:t>
+            </w:r>
+          </w:p>
+        </w:tc>
+      </w:tr>
+      <w:tr>
+        <w:trPr>
+          <w:cantSplit/>
+        </w:trPr>
+        <w:tc>
+          <w:tcPr>
+            <w:tcW w:type="dxa" w:w="454"/>
+          </w:tcPr>
+          <w:p>
+            <w:r>
+              <w:t>17</w:t>
+            </w:r>
+          </w:p>
+        </w:tc>
+        <w:tc>
+          <w:tcPr>
+            <w:tcW w:type="dxa" w:w="5783"/>
+          </w:tcPr>
+          <w:p>
+            <w:r>
+              <w:t>Уведомление руководителю ПТО. Нужно ли руководителю ПТО отдельное уведомление для планирования доставки? Если да, какое событие должно его вызывать?</w:t>
+            </w:r>
+          </w:p>
+        </w:tc>
+        <w:tc>
+          <w:tcPr>
+            <w:tcW w:type="dxa" w:w="3969"/>
+          </w:tcPr>
+          <w:p>
+            <w:r/>
+          </w:p>
+          <w:p/>
+          <w:p/>
+        </w:tc>
+      </w:tr>
+      <w:tr>
+        <w:trPr>
+          <w:cantSplit/>
+        </w:trPr>
+        <w:tc>
+          <w:tcPr>
+            <w:tcW w:type="dxa" w:w="454"/>
+          </w:tcPr>
+          <w:p>
+            <w:r>
+              <w:t>18</w:t>
+            </w:r>
+          </w:p>
+        </w:tc>
+        <w:tc>
+          <w:tcPr>
+            <w:tcW w:type="dxa" w:w="5783"/>
           </w:tcPr>
           <w:p>
             <w:r>
@@ -561,11 +971,13 @@
         </w:tc>
         <w:tc>
           <w:tcPr>
-            <w:tcW w:type="dxa" w:w="4422"/>
+            <w:tcW w:type="dxa" w:w="3969"/>
           </w:tcPr>
           <w:p>
             <w:r/>
           </w:p>
+          <w:p/>
+          <w:p/>
         </w:tc>
       </w:tr>
     </w:tbl>
@@ -579,17 +991,12 @@
     </w:p>
     <w:p>
       <w:r>
-        <w:t>Подтверждаю, что прочитал(а) вопросы и заполненные ответы отражают согласованный порядок работы. Если ответ зависит от условия, это условие указано. Приложенные документы относятся к актуальному процессу. Эти ответы можно использовать для подготовки технического задания; окончательное техническое задание согласуется отдельно.</w:t>
+        <w:t>Подтверждаю, что прочитал(а) вопросы и заполненные ответы отражают согласованный порядок работы. Условия и исключения указаны в ответах. Приложенные документы относятся к актуальному процессу. Эти ответы можно использовать для подготовки технического задания; окончательное техническое задание согласуется отдельно.</w:t>
       </w:r>
     </w:p>
     <w:p>
       <w:r>
-        <w:t>Должность согласующего: ____________________</w:t>
-      </w:r>
-    </w:p>
-    <w:p>
-      <w:r>
-        <w:t>Дата: ____________________</w:t>
+        <w:t>Должность согласующего: ____________________    Дата: ____________________</w:t>
       </w:r>
     </w:p>
     <w:p>
@@ -603,8 +1010,8 @@
       </w:r>
     </w:p>
     <w:sectPr>
-      <w:pgSz w:w="11906" w:h="16838"/>
-      <w:pgMar w:top="907" w:right="907" w:bottom="907" w:left="907" w:header="720" w:footer="720" w:gutter="0"/>
+      <w:pgSz w:w="12240" w:h="15840"/>
+      <w:pgMar w:top="907" w:right="850" w:bottom="907" w:left="850" w:header="720" w:footer="720" w:gutter="0"/>
       <w:cols w:space="720"/>
       <w:docGrid w:linePitch="360"/>
     </w:sectPr>
@@ -975,9 +1382,12 @@
     <w:name w:val="Normal"/>
     <w:qFormat/>
     <w:rsid w:val="00FC693F"/>
+    <w:pPr>
+      <w:spacing w:after="80"/>
+    </w:pPr>
     <w:rPr>
       <w:rFonts w:ascii="Arial" w:hAnsi="Arial"/>
-      <w:sz w:val="22"/>
+      <w:sz w:val="20"/>
     </w:rPr>
   </w:style>
   <w:style w:type="paragraph" w:styleId="Header">

</xml_diff>

<commit_message>
docs: finalize practical client clarification form after source review
Narrow repeated montage questions using the targeted SpeechKit comparison,
address Claude findings and preserve the source-to-process links. Keep client
answers and integration TZ approval separate from this document delivery.

ТЗ: docs/tz/TZ-DOCS-DELIVERY.md#U
Atom: eurosteklo-a58
</commit_message>
<xml_diff>
--- a/docs/review/2026-10-05-consistency/Евростекло-уточнение-процесса.docx
+++ b/docs/review/2026-10-05-consistency/Евростекло-уточнение-процесса.docx
@@ -17,7 +17,7 @@
     </w:p>
     <w:p>
       <w:pPr>
-        <w:pStyle w:val="Heading1"/>
+        <w:pStyle w:val="Heading2"/>
       </w:pPr>
       <w:r>
         <w:t>Контроль сделки и обратная связь</w:t>
@@ -31,12 +31,13 @@
         <w:tblLook w:firstColumn="1" w:firstRow="1" w:lastColumn="0" w:lastRow="0" w:noHBand="0" w:noVBand="1" w:val="04A0"/>
       </w:tblPr>
       <w:tblGrid>
-        <w:gridCol w:w="454"/>
-        <w:gridCol w:w="5783"/>
-        <w:gridCol w:w="3969"/>
+        <w:gridCol w:w="3475"/>
+        <w:gridCol w:w="3475"/>
+        <w:gridCol w:w="3475"/>
       </w:tblGrid>
       <w:tr>
         <w:trPr>
+          <w:cantSplit/>
           <w:tblHeader/>
         </w:trPr>
         <w:tc>
@@ -101,8 +102,6 @@
           <w:p>
             <w:r/>
           </w:p>
-          <w:p/>
-          <w:p/>
         </w:tc>
       </w:tr>
       <w:tr>
@@ -136,8 +135,6 @@
           <w:p>
             <w:r/>
           </w:p>
-          <w:p/>
-          <w:p/>
         </w:tc>
       </w:tr>
       <w:tr>
@@ -160,7 +157,7 @@
           </w:tcPr>
           <w:p>
             <w:r>
-              <w:t>Сумма заказа для звонковКакую минимальную сумму заказа устанавливаем для звонков по обратной связи? Если ограничение по сумме не нужно, напишите «Звоним всем».</w:t>
+              <w:t>Есть ли минимальная сумма заказа, начиная с которой собирают обратную связь? Если да, укажите окончательный порог. Если порога нет, напишите «для всех заказов».</w:t>
             </w:r>
           </w:p>
         </w:tc>
@@ -171,8 +168,6 @@
           <w:p>
             <w:r/>
           </w:p>
-          <w:p/>
-          <w:p/>
         </w:tc>
       </w:tr>
       <w:tr>
@@ -195,7 +190,7 @@
           </w:tcPr>
           <w:p>
             <w:r>
-              <w:t>Повторный дозвон. Если ассистент отдела продаж не дозвонился до клиента для обратной связи, сколько повторных попыток он делает, с каким интервалом и когда прекращает попытки? Если интервал указан в днях, уточните: рабочих или календарных.</w:t>
+              <w:t>После первой попытки связаться с клиентом для обратной связи сколько повторных попыток делает ассистент? При каком условии прекращают попытки и где фиксируют результат?</w:t>
             </w:r>
           </w:p>
         </w:tc>
@@ -206,14 +201,12 @@
           <w:p>
             <w:r/>
           </w:p>
-          <w:p/>
-          <w:p/>
         </w:tc>
       </w:tr>
     </w:tbl>
     <w:p>
       <w:pPr>
-        <w:pStyle w:val="Heading1"/>
+        <w:pStyle w:val="Heading2"/>
       </w:pPr>
       <w:r>
         <w:t>Замер и расчёт цены</w:t>
@@ -227,12 +220,13 @@
         <w:tblLook w:firstColumn="1" w:firstRow="1" w:lastColumn="0" w:lastRow="0" w:noHBand="0" w:noVBand="1" w:val="04A0"/>
       </w:tblPr>
       <w:tblGrid>
-        <w:gridCol w:w="454"/>
-        <w:gridCol w:w="5783"/>
-        <w:gridCol w:w="3969"/>
+        <w:gridCol w:w="3475"/>
+        <w:gridCol w:w="3475"/>
+        <w:gridCol w:w="3475"/>
       </w:tblGrid>
       <w:tr>
         <w:trPr>
+          <w:cantSplit/>
           <w:tblHeader/>
         </w:trPr>
         <w:tc>
@@ -297,8 +291,6 @@
           <w:p>
             <w:r/>
           </w:p>
-          <w:p/>
-          <w:p/>
         </w:tc>
       </w:tr>
       <w:tr>
@@ -332,14 +324,12 @@
           <w:p>
             <w:r/>
           </w:p>
-          <w:p/>
-          <w:p/>
         </w:tc>
       </w:tr>
     </w:tbl>
     <w:p>
       <w:pPr>
-        <w:pStyle w:val="Heading1"/>
+        <w:pStyle w:val="Heading2"/>
       </w:pPr>
       <w:r>
         <w:t>Проверка договора</w:t>
@@ -353,12 +343,13 @@
         <w:tblLook w:firstColumn="1" w:firstRow="1" w:lastColumn="0" w:lastRow="0" w:noHBand="0" w:noVBand="1" w:val="04A0"/>
       </w:tblPr>
       <w:tblGrid>
-        <w:gridCol w:w="454"/>
-        <w:gridCol w:w="5783"/>
-        <w:gridCol w:w="3969"/>
+        <w:gridCol w:w="3475"/>
+        <w:gridCol w:w="3475"/>
+        <w:gridCol w:w="3475"/>
       </w:tblGrid>
       <w:tr>
         <w:trPr>
+          <w:cantSplit/>
           <w:tblHeader/>
         </w:trPr>
         <w:tc>
@@ -412,7 +403,7 @@
           </w:tcPr>
           <w:p>
             <w:r>
-              <w:t>Юрист не ответил в срок. Для проверки договора обсуждались три рабочих дня. Кто и что делает, если этот срок истёк, а ответа нет? Как после этого продолжается работа со сделкой? Укажите также событие, от которого отсчитываются эти три рабочих дня.</w:t>
+              <w:t>От какого события отсчитываются три рабочих дня на проверку договора юристом? Что должен сделать менеджер, если срок истёк, а результат проверки не получен?</w:t>
             </w:r>
           </w:p>
         </w:tc>
@@ -423,14 +414,12 @@
           <w:p>
             <w:r/>
           </w:p>
-          <w:p/>
-          <w:p/>
         </w:tc>
       </w:tr>
     </w:tbl>
     <w:p>
       <w:pPr>
-        <w:pStyle w:val="Heading1"/>
+        <w:pStyle w:val="Heading2"/>
       </w:pPr>
       <w:r>
         <w:t>Документы</w:t>
@@ -444,12 +433,13 @@
         <w:tblLook w:firstColumn="1" w:firstRow="1" w:lastColumn="0" w:lastRow="0" w:noHBand="0" w:noVBand="1" w:val="04A0"/>
       </w:tblPr>
       <w:tblGrid>
-        <w:gridCol w:w="454"/>
-        <w:gridCol w:w="5783"/>
-        <w:gridCol w:w="3969"/>
+        <w:gridCol w:w="3475"/>
+        <w:gridCol w:w="3475"/>
+        <w:gridCol w:w="3475"/>
       </w:tblGrid>
       <w:tr>
         <w:trPr>
+          <w:cantSplit/>
           <w:tblHeader/>
         </w:trPr>
         <w:tc>
@@ -503,7 +493,7 @@
           </w:tcPr>
           <w:p>
             <w:r>
-              <w:t>Кто отвечает за подготовку и прикрепление закрывающих документов к сделке: менеджер или ассистент отдела продаж? Если обязанности разделены, укажите, что делает каждый. При нашей доставке отдельно укажите, кто принимает подписанные документы от водителя и передаёт их ассистенту для контроля возврата.</w:t>
+              <w:t>Кто отвечает за подготовку и прикрепление закрывающих документов к сделке: менеджер или ассистент отдела продаж? Если обязанности разделены, укажите, что делает каждый. При нашей доставке отдельно укажите, кто принимает подписанные документы от водителя и передаёт их ассистенту для контроля возврата. Если договор ещё проверяет юрист, можно ли выписывать и передавать УПД? Кто принимает это решение?</w:t>
             </w:r>
           </w:p>
         </w:tc>
@@ -514,8 +504,6 @@
           <w:p>
             <w:r/>
           </w:p>
-          <w:p/>
-          <w:p/>
         </w:tc>
       </w:tr>
       <w:tr>
@@ -549,8 +537,6 @@
           <w:p>
             <w:r/>
           </w:p>
-          <w:p/>
-          <w:p/>
         </w:tc>
       </w:tr>
       <w:tr>
@@ -584,14 +570,12 @@
           <w:p>
             <w:r/>
           </w:p>
-          <w:p/>
-          <w:p/>
         </w:tc>
       </w:tr>
     </w:tbl>
     <w:p>
       <w:pPr>
-        <w:pStyle w:val="Heading1"/>
+        <w:pStyle w:val="Heading2"/>
       </w:pPr>
       <w:r>
         <w:t>Монтаж и приёмка</w:t>
@@ -605,12 +589,13 @@
         <w:tblLook w:firstColumn="1" w:firstRow="1" w:lastColumn="0" w:lastRow="0" w:noHBand="0" w:noVBand="1" w:val="04A0"/>
       </w:tblPr>
       <w:tblGrid>
-        <w:gridCol w:w="454"/>
-        <w:gridCol w:w="5783"/>
-        <w:gridCol w:w="3969"/>
+        <w:gridCol w:w="3475"/>
+        <w:gridCol w:w="3475"/>
+        <w:gridCol w:w="3475"/>
       </w:tblGrid>
       <w:tr>
         <w:trPr>
+          <w:cantSplit/>
           <w:tblHeader/>
         </w:trPr>
         <w:tc>
@@ -664,7 +649,7 @@
           </w:tcPr>
           <w:p>
             <w:r>
-              <w:t>Когда монтаж выполнен, кто подтверждает его завершение и передаёт сделку на закрытие? Укажите должность, какие документы и фотографии этот сотрудник проверяет и какое его действие означает, что монтаж принят. Контроль возврата оригиналов ассистентом отдела продаж повторно описывать не нужно.</w:t>
+              <w:t>Для контроля качества монтажа достаточно подписанных клиентом документов и фотографий в сделке или требуется отдельное подтверждение руководителя службы сервиса? Если требуется, укажите, где оно фиксируется.</w:t>
             </w:r>
           </w:p>
         </w:tc>
@@ -675,8 +660,6 @@
           <w:p>
             <w:r/>
           </w:p>
-          <w:p/>
-          <w:p/>
         </w:tc>
       </w:tr>
       <w:tr>
@@ -710,8 +693,6 @@
           <w:p>
             <w:r/>
           </w:p>
-          <w:p/>
-          <w:p/>
         </w:tc>
       </w:tr>
       <w:tr>
@@ -734,7 +715,7 @@
           </w:tcPr>
           <w:p>
             <w:r>
-              <w:t>Клиент не принимает монтаж. Если работы выполнены, но клиент отказывается подписать приёмку, кто разбирает причину, как оформляется результат и при каком условии работа считается принятой?</w:t>
+              <w:t>Если клиент отказался подписать акт после монтажа, кто разбирает отказ, где фиксируют причину и какое решение позволяет завершить приёмку?</w:t>
             </w:r>
           </w:p>
         </w:tc>
@@ -745,8 +726,6 @@
           <w:p>
             <w:r/>
           </w:p>
-          <w:p/>
-          <w:p/>
         </w:tc>
       </w:tr>
       <w:tr>
@@ -769,7 +748,7 @@
           </w:tcPr>
           <w:p>
             <w:r>
-              <w:t>Переделка до приёмки. Если до подписания приёмки требуется исправить выполненный монтаж, кто организует исправление и кто подтверждает его результат? Остаётся ли исходная сделка открытой до этого подтверждения? Позднейшие рекламации здесь не уточняются.</w:t>
+              <w:t>Перенос даты монтажа. Если клиент переносит согласованную дату, кто фиксирует новую дату, сообщает её бригаде и меняет состояние заказа, если такое изменение требуется?</w:t>
             </w:r>
           </w:p>
         </w:tc>
@@ -780,8 +759,6 @@
           <w:p>
             <w:r/>
           </w:p>
-          <w:p/>
-          <w:p/>
         </w:tc>
       </w:tr>
       <w:tr>
@@ -804,7 +781,7 @@
           </w:tcPr>
           <w:p>
             <w:r>
-              <w:t>Перенос даты монтажа. Если клиент переносит согласованную дату, кто фиксирует новую дату, сообщает её бригаде и меняет состояние заказа, если такое изменение требуется?</w:t>
+              <w:t>Какая часть стоимости монтажа оплачивается до выезда бригады? Если размер предоплаты зависит от условий договора, укажите варианты.</w:t>
             </w:r>
           </w:p>
         </w:tc>
@@ -815,8 +792,6 @@
           <w:p>
             <w:r/>
           </w:p>
-          <w:p/>
-          <w:p/>
         </w:tc>
       </w:tr>
       <w:tr>
@@ -839,7 +814,7 @@
           </w:tcPr>
           <w:p>
             <w:r>
-              <w:t>Оплата монтажа. Какую часть стоимости монтажа клиент оплачивает до начала работ, а какую — после приёмки? Если всегда действует один порядок, укажите его; если порядок зависит от договора, укажите условие.</w:t>
+              <w:t>Можно ли завершить сделку после загрузки подписанных документов в CRM, если бумажные оригиналы ещё не вернулись? Если нельзя, укажите, кто разрешает завершение сделки и при каком условии.</w:t>
             </w:r>
           </w:p>
         </w:tc>
@@ -850,14 +825,12 @@
           <w:p>
             <w:r/>
           </w:p>
-          <w:p/>
-          <w:p/>
         </w:tc>
       </w:tr>
     </w:tbl>
     <w:p>
       <w:pPr>
-        <w:pStyle w:val="Heading1"/>
+        <w:pStyle w:val="Heading2"/>
       </w:pPr>
       <w:r>
         <w:t>Уведомления и структура карточек</w:t>
@@ -871,12 +844,13 @@
         <w:tblLook w:firstColumn="1" w:firstRow="1" w:lastColumn="0" w:lastRow="0" w:noHBand="0" w:noVBand="1" w:val="04A0"/>
       </w:tblPr>
       <w:tblGrid>
-        <w:gridCol w:w="454"/>
-        <w:gridCol w:w="5783"/>
-        <w:gridCol w:w="3969"/>
+        <w:gridCol w:w="3475"/>
+        <w:gridCol w:w="3475"/>
+        <w:gridCol w:w="3475"/>
       </w:tblGrid>
       <w:tr>
         <w:trPr>
+          <w:cantSplit/>
           <w:tblHeader/>
         </w:trPr>
         <w:tc>
@@ -941,8 +915,6 @@
           <w:p>
             <w:r/>
           </w:p>
-          <w:p/>
-          <w:p/>
         </w:tc>
       </w:tr>
       <w:tr>
@@ -976,14 +948,12 @@
           <w:p>
             <w:r/>
           </w:p>
-          <w:p/>
-          <w:p/>
         </w:tc>
       </w:tr>
     </w:tbl>
     <w:p>
       <w:pPr>
-        <w:pStyle w:val="Heading1"/>
+        <w:pStyle w:val="Heading2"/>
       </w:pPr>
       <w:r>
         <w:t>Подтверждение ответов</w:t>
@@ -996,7 +966,7 @@
     </w:p>
     <w:p>
       <w:r>
-        <w:t>Должность согласующего: ____________________    Дата: ____________________</w:t>
+        <w:t>Должность согласующего: ____________________　Дата: ____________________</w:t>
       </w:r>
     </w:p>
     <w:p>
@@ -1009,9 +979,14 @@
         <w:t>Если требуется исправить другой ранее описанный шаг процесса, укажите только это изменение: ____________________</w:t>
       </w:r>
     </w:p>
+    <w:p>
+      <w:r>
+        <w:t>Для заполнения и сохранения ответов используйте Word-файл . Введённые на этой странице ответы автоматически не сохраняются.</w:t>
+      </w:r>
+    </w:p>
     <w:sectPr>
       <w:pgSz w:w="12240" w:h="15840"/>
-      <w:pgMar w:top="907" w:right="850" w:bottom="907" w:left="850" w:header="720" w:footer="720" w:gutter="0"/>
+      <w:pgMar w:top="850" w:right="907" w:bottom="850" w:left="907" w:header="720" w:footer="720" w:gutter="0"/>
       <w:cols w:space="720"/>
       <w:docGrid w:linePitch="360"/>
     </w:sectPr>
@@ -1382,9 +1357,6 @@
     <w:name w:val="Normal"/>
     <w:qFormat/>
     <w:rsid w:val="00FC693F"/>
-    <w:pPr>
-      <w:spacing w:after="80"/>
-    </w:pPr>
     <w:rPr>
       <w:rFonts w:ascii="Arial" w:hAnsi="Arial"/>
       <w:sz w:val="20"/>

</xml_diff>